<commit_message>
Set 1 report: sync numbers and figures with notebook, clean writing, add figure cross-references
</commit_message>
<xml_diff>
--- a/Set 1/GAN_Assignment_Report_Set_1.docx
+++ b/Set 1/GAN_Assignment_Report_Set_1.docx
@@ -69,7 +69,7 @@
       </w:pPr>
       <w:r>
         <w:rPr/>
-        <w:t xml:space="preserve">A Generative Adversarial Network (GAN) trains two networks against each other: a generator that turns random noise into samples, and a discriminator that tries to tell real data from generated data. As the discriminator sharpens, the generator is pushed to produce more convincing samples, and at the ideal equilibrium the discriminator is no better than a coin toss (Goodfellow et al., 2014). This report applies that idea in two stages. Part 1 builds a GAN from scratch in PyTorch on synthetic 2D data, where learning is visible on a scatter plot. Part 2 applies GANs to three real problems: OCT retinal scans (medicine), network-flow records (cybersecurity) and doodles (creative arts). Throughout, the focus is on why each architecture suits its data and on interpreting what the models actually produce.</w:t>
+        <w:t xml:space="preserve">A generative adversarial network (GAN) trains two networks against each other. A generator turns random noise into samples, and a discriminator tries to tell real data from generated data. As the discriminator sharpens, the generator is pushed to produce more convincing samples, and at the ideal equilibrium the discriminator can do no better than guess (Goodfellow et al., 2014). This report applies the idea in two stages. Part 1 builds a GAN from scratch in PyTorch on synthetic 2D data, where the learning is visible on a scatter plot. Part 2 then applies GANs to the three problem areas set by the brief: OCT retinal scans in medicine, network-flow records in cybersecurity, and QuickDraw doodles in the creative arts. In each case the report explains why the chosen architecture suits the data and interprets what the trained model produces.</w:t>
       </w:r>
     </w:p>
     <w:p>
@@ -78,33 +78,27 @@
       </w:pPr>
       <w:r>
         <w:rPr/>
-        <w:t xml:space="preserve">2. Part 1: Building and Understanding GANs from Scratch</w:t>
-      </w:r>
-    </w:p>
-    <w:p>
-      <w:pPr>
-        <w:spacing w:after="140"/>
-        <w:jc w:val="both"/>
-      </w:pPr>
-      <w:r>
-        <w:rPr/>
-        <w:t xml:space="preserve">All three Part 1 tasks share a fixed recipe so comparisons stay controlled: BatchNorm (Ioffe and Szegedy, 2015) in the generator, Adam (Kingma and Ba, 2015) with betas = (0.5, 0.999), and one-sided label smoothing with a real target of 0.9 (Salimans et al., 2016). The lower beta1 damps oscillation and the smoothing stops the discriminator becoming over-confident and starving the generator of gradient. The latent dimension is 16 and hidden layers are 64 units wide.</w:t>
-      </w:r>
-    </w:p>
-    <w:p>
-      <w:pPr>
-        <w:spacing w:after="140"/>
-        <w:jc w:val="both"/>
-      </w:pPr>
-      <w:r>
-        <w:rPr>
-          <w:b/>
-        </w:rPr>
-        <w:t xml:space="preserve">Task 1 (sine wave).</w:t>
-      </w:r>
-      <w:r>
-        <w:rPr/>
-        <w:t xml:space="preserve"> The baseline reproduces the tutorial: points from y = sin(x) with small noise, a two-layer ReLU generator trained 5,000 epochs against a LeakyReLU discriminator. The losses settle into a stable balance (ending D approx 1.36, G approx 0.83).</w:t>
+        <w:t xml:space="preserve">2. Part 1: building and understanding GANs from scratch</w:t>
+      </w:r>
+    </w:p>
+    <w:p>
+      <w:pPr>
+        <w:spacing w:after="140"/>
+        <w:jc w:val="both"/>
+      </w:pPr>
+      <w:r>
+        <w:rPr/>
+        <w:t xml:space="preserve">All three Part 1 tasks share one fixed training recipe so the comparisons stay controlled. The generator uses BatchNorm (Ioffe and Szegedy, 2015), optimisation is Adam (Kingma and Ba, 2015) with betas of (0.5, 0.999), and training applies one-sided label smoothing with a real target of 0.9 (Salimans et al., 2016). The lower beta1 damps oscillation, and the smoothing stops the discriminator from becoming over-confident and starving the generator of gradient. The latent dimension is 16 and the hidden layers are 64 units wide.</w:t>
+      </w:r>
+    </w:p>
+    <w:p>
+      <w:pPr>
+        <w:spacing w:after="140"/>
+        <w:jc w:val="both"/>
+      </w:pPr>
+      <w:r>
+        <w:rPr/>
+        <w:t xml:space="preserve">The first task reproduces the tutorial sine-wave GAN. Points are drawn from y = sin(x) with a little added noise, and a two-layer ReLU generator trains for 5,000 epochs against a LeakyReLU discriminator. The two losses settle into a stable balance, ending at about D = 1.36 and G = 0.83.</w:t>
       </w:r>
     </w:p>
     <w:p>
@@ -115,7 +109,7 @@
       <w:r>
         <w:drawing>
           <wp:inline distT="0" distB="0" distL="0" distR="0">
-            <wp:extent cx="5212080" cy="4432242"/>
+            <wp:extent cx="2580685" cy="2194560"/>
             <wp:effectExtent l="0" t="0" r="0" b="0"/>
             <wp:docPr id="1" name="Picture 1"/>
             <wp:cNvGraphicFramePr>
@@ -137,7 +131,7 @@
                   <pic:spPr>
                     <a:xfrm>
                       <a:off x="0" y="0"/>
-                      <a:ext cx="5212080" cy="4432242"/>
+                      <a:ext cx="2580685" cy="2194560"/>
                     </a:xfrm>
                     <a:prstGeom prst="rect">
                       <a:avLst/>
@@ -174,39 +168,27 @@
       </w:pPr>
       <w:r>
         <w:rPr/>
-        <w:t xml:space="preserve">The generated points follow y = sin(x) across the whole domain, thinning only slightly at the crests, which confirms the loop works before moving to a harder target.</w:t>
-      </w:r>
-    </w:p>
-    <w:p>
-      <w:pPr>
-        <w:spacing w:after="140"/>
-        <w:jc w:val="both"/>
-      </w:pPr>
-      <w:r>
-        <w:rPr>
-          <w:b/>
-        </w:rPr>
-        <w:t xml:space="preserve">Task 2 (spiral).</w:t>
-      </w:r>
-      <w:r>
-        <w:rPr/>
-        <w:t xml:space="preserve"> For the new distribution I chose a 2D Archimedean spiral, sampled with a square-root radius so points spread evenly and scaled to about [-1.3, 1.3]. A spiral is deliberately awkward - a thin, multi-turn manifold that a vanilla GAN tends to collapse into a blob. Trained for 10,000 epochs, the generator recovers both arms and the central curl, with D in the 1.25-1.36 band and G in 0.80-0.86 throughout; this only holds because of the stabilisers, BatchNorm especially.</w:t>
-      </w:r>
-    </w:p>
-    <w:p>
-      <w:pPr>
-        <w:spacing w:after="140"/>
-        <w:jc w:val="both"/>
-      </w:pPr>
-      <w:r>
-        <w:rPr>
-          <w:b/>
-        </w:rPr>
-        <w:t xml:space="preserve">Task 3 (architecture change).</w:t>
-      </w:r>
-      <w:r>
-        <w:rPr/>
-        <w:t xml:space="preserve"> I change exactly two things and hold the rest fixed: activation from ReLU to LeakyReLU(0.2), and hidden depth from 2 to 4. LeakyReLU keeps a gradient for negative inputs (fewer dead units) and the extra depth adds capacity to bend a thin curve.</w:t>
+        <w:t xml:space="preserve">In Figure 1 the generated points follow y = sin(x) across the whole domain and thin only slightly at the crests, which confirms the training loop works before I move on to a harder target.</w:t>
+      </w:r>
+    </w:p>
+    <w:p>
+      <w:pPr>
+        <w:spacing w:after="140"/>
+        <w:jc w:val="both"/>
+      </w:pPr>
+      <w:r>
+        <w:rPr/>
+        <w:t xml:space="preserve">For the new 2D distribution I chose an Archimedean spiral, sampled with a square-root radius so the points spread evenly and scaled to roughly [-1.3, 1.3]. The spiral is a deliberately awkward target, a thin multi-turn manifold that a plain GAN tends to collapse into a single blob. After 10,000 epochs the generator recovers both arms and the central curl, with D staying in the 1.25 to 1.36 band and G in the 0.80 to 0.86 band throughout. This stability holds only because of the stabilisers, and BatchNorm in particular.</w:t>
+      </w:r>
+    </w:p>
+    <w:p>
+      <w:pPr>
+        <w:spacing w:after="140"/>
+        <w:jc w:val="both"/>
+      </w:pPr>
+      <w:r>
+        <w:rPr/>
+        <w:t xml:space="preserve">The third task changes exactly two things and holds everything else fixed. The activation moves from ReLU to LeakyReLU(0.2), and the hidden depth grows from two layers to four. LeakyReLU keeps a gradient for negative inputs, which leaves fewer dead units, and the added depth gives the generator more capacity to bend a thin curve.</w:t>
       </w:r>
     </w:p>
     <w:p>
@@ -217,7 +199,7 @@
       <w:r>
         <w:drawing>
           <wp:inline distT="0" distB="0" distL="0" distR="0">
-            <wp:extent cx="5212080" cy="1715190"/>
+            <wp:extent cx="4206240" cy="1384189"/>
             <wp:effectExtent l="0" t="0" r="0" b="0"/>
             <wp:docPr id="2" name="Picture 2"/>
             <wp:cNvGraphicFramePr>
@@ -239,7 +221,7 @@
                   <pic:spPr>
                     <a:xfrm>
                       <a:off x="0" y="0"/>
-                      <a:ext cx="5212080" cy="1715190"/>
+                      <a:ext cx="4206240" cy="1384189"/>
                     </a:xfrm>
                     <a:prstGeom prst="rect">
                       <a:avLst/>
@@ -276,7 +258,7 @@
       </w:pPr>
       <w:r>
         <w:rPr/>
-        <w:t xml:space="preserve">The original ReLU/depth-2 model scatters stray points off the curve and partly fills the empty centre, while the deeper LeakyReLU model draws a tighter, cleaner spiral. The cost appears in the losses: the modified generator runs higher and noisier (up towards 1.5-1.8, ending G approx 1.19) rather than flat near 0.82 - the signature of a higher-capacity generator working harder, not of instability.</w:t>
+        <w:t xml:space="preserve">In Figure 2 the original ReLU depth-2 model scatters stray points off the curve and partly fills the empty centre, while the deeper LeakyReLU model draws a tighter, cleaner spiral. That gain shows up in the losses. The modified generator runs higher and noisier, climbing towards 1.5 to 1.8 and ending near G = 1.19, where the original stayed flat around 0.82. This higher and noisier trace is the expected signature of a larger generator working harder, and the run stays stable throughout.</w:t>
       </w:r>
     </w:p>
     <w:p>
@@ -285,39 +267,27 @@
       </w:pPr>
       <w:r>
         <w:rPr/>
-        <w:t xml:space="preserve">3. Part 2.1: OCTMNIST Retinal Images (DCGAN, TensorFlow/Keras)</w:t>
-      </w:r>
-    </w:p>
-    <w:p>
-      <w:pPr>
-        <w:spacing w:after="140"/>
-        <w:jc w:val="both"/>
-      </w:pPr>
-      <w:r>
-        <w:rPr>
-          <w:b/>
-        </w:rPr>
-        <w:t xml:space="preserve">Dataset.</w:t>
-      </w:r>
-      <w:r>
-        <w:rPr/>
-        <w:t xml:space="preserve"> OCTMNIST, from MedMNIST v2 (Yang et al., 2023), has 97,477 training scans (28x28 grayscale) across four imbalanced classes: choroidal neovascularization, diabetic macular edema, drusen and normal. The shared structure is a bright, curved retinal band over a darker background with faint layering beneath.</w:t>
-      </w:r>
-    </w:p>
-    <w:p>
-      <w:pPr>
-        <w:spacing w:after="140"/>
-        <w:jc w:val="both"/>
-      </w:pPr>
-      <w:r>
-        <w:rPr>
-          <w:b/>
-        </w:rPr>
-        <w:t xml:space="preserve">Model and justification.</w:t>
-      </w:r>
-      <w:r>
-        <w:rPr/>
-        <w:t xml:space="preserve"> Because that structure is spatial and local, a DCGAN is the natural choice over a fully-connected GAN (Radford et al., 2016). The generator maps a 100-D latent vector through a dense layer and three Conv2DTranspose blocks (BatchNorm + ReLU) to a 32x32 tanh image (approx 1.08M parameters); the discriminator mirrors it with strided Conv2D, LeakyReLU and 0.3 dropout. Training uses Adam (lr = 2e-4, beta1 = 0.5) with label smoothing on a 30,000-image subset for 60 epochs.</w:t>
+        <w:t xml:space="preserve">3. Part 2.1: OCTMNIST retinal images (DCGAN, TensorFlow/Keras)</w:t>
+      </w:r>
+    </w:p>
+    <w:p>
+      <w:pPr>
+        <w:spacing w:after="140"/>
+        <w:jc w:val="both"/>
+      </w:pPr>
+      <w:r>
+        <w:rPr/>
+        <w:t xml:space="preserve">OCTMNIST comes from MedMNIST v2 (Yang et al., 2023) and holds 97,477 training scans at 28x28 grayscale, spread unevenly across four classes: choroidal neovascularisation, diabetic macular edema, drusen and normal. Every scan shares the same broad structure, a bright curved retinal band sitting over a darker background with faint layering beneath.</w:t>
+      </w:r>
+    </w:p>
+    <w:p>
+      <w:pPr>
+        <w:spacing w:after="140"/>
+        <w:jc w:val="both"/>
+      </w:pPr>
+      <w:r>
+        <w:rPr/>
+        <w:t xml:space="preserve">Because that structure is spatial and local, a DCGAN is a better fit than a fully connected GAN (Radford et al., 2016). The generator maps a 100-dimensional latent vector through a dense layer and three Conv2DTranspose blocks, each with BatchNorm and ReLU, up to a 32x32 image with a tanh output, giving about 1.08M parameters. The discriminator mirrors this with strided Conv2D layers, LeakyReLU and 0.3 dropout. Training uses Adam at learning rate 2e-4 with beta1 = 0.5 and label smoothing, run on a 30,000-image subset for 60 epochs.</w:t>
       </w:r>
     </w:p>
     <w:p>
@@ -328,7 +298,7 @@
       <w:r>
         <w:drawing>
           <wp:inline distT="0" distB="0" distL="0" distR="0">
-            <wp:extent cx="5212080" cy="2863900"/>
+            <wp:extent cx="3993931" cy="2194560"/>
             <wp:effectExtent l="0" t="0" r="0" b="0"/>
             <wp:docPr id="3" name="Picture 3"/>
             <wp:cNvGraphicFramePr>
@@ -350,7 +320,7 @@
                   <pic:spPr>
                     <a:xfrm>
                       <a:off x="0" y="0"/>
-                      <a:ext cx="5212080" cy="2863900"/>
+                      <a:ext cx="3993931" cy="2194560"/>
                     </a:xfrm>
                     <a:prstGeom prst="rect">
                       <a:avLst/>
@@ -387,7 +357,7 @@
       </w:pPr>
       <w:r>
         <w:rPr/>
-        <w:t xml:space="preserve">The fakes capture the retinal band and vary across the batch (no mode collapse). The FID (Heusel et al., 2017) is 79.02 - high, and consistent with the visible blur where fine sub-layers and speckle are lost. Three factors inflate it beyond raw quality: only 60 epochs on a subset, the 28-&gt;32 px upscaling, and FID's ImageNet-trained InceptionV3 (Szegedy et al., 2016), which never saw single-channel medical images.</w:t>
+        <w:t xml:space="preserve">In Figure 3 the generated scans capture the retinal band and vary across the batch, so there is no mode collapse. Their FID (Heusel et al., 2017) is 66.83, which is fairly high and matches the visible blur where the fine sub-layers and speckle are lost. Three things push the number up beyond the raw visual quality: the model saw only 60 epochs on a subset, the scans were upscaled from 28 to 32 pixels, and FID relies on an ImageNet-trained InceptionV3 (Szegedy et al., 2016) that has never seen single-channel medical images.</w:t>
       </w:r>
     </w:p>
     <w:p>
@@ -398,7 +368,7 @@
       <w:r>
         <w:drawing>
           <wp:inline distT="0" distB="0" distL="0" distR="0">
-            <wp:extent cx="5212080" cy="3005786"/>
+            <wp:extent cx="3855915" cy="2194560"/>
             <wp:effectExtent l="0" t="0" r="0" b="0"/>
             <wp:docPr id="4" name="Picture 4"/>
             <wp:cNvGraphicFramePr>
@@ -420,7 +390,7 @@
                   <pic:spPr>
                     <a:xfrm>
                       <a:off x="0" y="0"/>
-                      <a:ext cx="5212080" cy="3005786"/>
+                      <a:ext cx="3855915" cy="2194560"/>
                     </a:xfrm>
                     <a:prstGeom prst="rect">
                       <a:avLst/>
@@ -457,7 +427,7 @@
       </w:pPr>
       <w:r>
         <w:rPr/>
-        <w:t xml:space="preserve">The discriminator loss stays low (approx 0.4-0.6) while the generator oscillates in the 2-5 range without collapsing - a discriminator that keeps a modest edge but never wins outright, so the generator kept receiving usable gradient throughout.</w:t>
+        <w:t xml:space="preserve">Figure 4 shows the discriminator loss staying low, around 0.4 to 0.6, while the generator loss oscillates in the 2 to 5 range without collapsing. The discriminator keeps a modest edge yet never wins outright, so the generator continues to receive usable gradient throughout training.</w:t>
       </w:r>
     </w:p>
     <w:p>
@@ -468,7 +438,7 @@
       <w:r>
         <w:drawing>
           <wp:inline distT="0" distB="0" distL="0" distR="0">
-            <wp:extent cx="5212080" cy="1212624"/>
+            <wp:extent cx="4206240" cy="978609"/>
             <wp:effectExtent l="0" t="0" r="0" b="0"/>
             <wp:docPr id="5" name="Picture 5"/>
             <wp:cNvGraphicFramePr>
@@ -490,7 +460,7 @@
                   <pic:spPr>
                     <a:xfrm>
                       <a:off x="0" y="0"/>
-                      <a:ext cx="5212080" cy="1212624"/>
+                      <a:ext cx="4206240" cy="978609"/>
                     </a:xfrm>
                     <a:prstGeom prst="rect">
                       <a:avLst/>
@@ -527,39 +497,27 @@
       </w:pPr>
       <w:r>
         <w:rPr/>
-        <w:t xml:space="preserve">Epoch snapshots go from random texture at epoch 1 to a recognisable layered band by the middle epochs, then only sharpen - the generator is learning scan structure progressively rather than memorising one image.</w:t>
-      </w:r>
-    </w:p>
-    <w:p>
-      <w:pPr>
-        <w:spacing w:after="140"/>
-        <w:jc w:val="both"/>
-      </w:pPr>
-      <w:r>
-        <w:rPr>
-          <w:b/>
-        </w:rPr>
-        <w:t xml:space="preserve">Reflection - the “duck test”.</w:t>
-      </w:r>
-      <w:r>
-        <w:rPr/>
-        <w:t xml:space="preserve"> This is the hazard the brief calls generating “ducks”: if a scan looks like a duck and quacks like one, the discriminator accepts it, because it only ever answers “real or fake” and never “is this physiologically valid”. The generator can therefore invent a bright band or lesion-like patch that never occurred in a real patient, mimicking disease that is absent or smoothing over a real anomaly. A synthetic scan must never be used diagnostically; the defensible uses are augmentation and teaching, and any model trained on synthetic scans should be validated on a real-only holdout to confirm it has not just learned to spot GAN artefacts.</w:t>
-      </w:r>
-    </w:p>
-    <w:p>
-      <w:pPr>
-        <w:spacing w:after="140"/>
-        <w:jc w:val="both"/>
-      </w:pPr>
-      <w:r>
-        <w:rPr>
-          <w:b/>
-        </w:rPr>
-        <w:t xml:space="preserve">Extension: conditional GAN.</w:t>
-      </w:r>
-      <w:r>
-        <w:rPr/>
-        <w:t xml:space="preserve"> The unconditional model cannot be asked for a specific class. A conditional GAN (Mirza and Osindero, 2014) feeds the label into both networks - embedded and concatenated with the latent vector for the generator, and as an extra image channel for the discriminator - forcing per-class realism. Classes are oversampled to balance the data and the discriminator uses a slower learning rate, a two-time-scale update that stabilises training (Heusel et al., 2017).</w:t>
+        <w:t xml:space="preserve">In Figure 5 the epoch snapshots move from random texture at epoch 1 to a recognisable layered band by the middle epochs, after which they mainly sharpen. This gradual progression indicates the generator is learning the structure of the scans over time and not copying a single stored image.</w:t>
+      </w:r>
+    </w:p>
+    <w:p>
+      <w:pPr>
+        <w:spacing w:after="140"/>
+        <w:jc w:val="both"/>
+      </w:pPr>
+      <w:r>
+        <w:rPr/>
+        <w:t xml:space="preserve">This is exactly the hazard the brief calls generating 'ducks'. If a scan looks like a duck and quacks like one, the discriminator will accept it, because it only ever answers the question 'real or fake' and never 'is this physiologically valid'. The generator can therefore invent a bright band or a lesion-like patch that never occurred in a real patient, either mimicking disease that is absent or smoothing over a genuine anomaly. A synthetic scan must never be used for diagnosis. Its defensible uses are data augmentation and teaching, and any model trained on synthetic scans should be checked against a real-only holdout to confirm it has learned real pathology and not just how to spot GAN artefacts.</w:t>
+      </w:r>
+    </w:p>
+    <w:p>
+      <w:pPr>
+        <w:spacing w:after="140"/>
+        <w:jc w:val="both"/>
+      </w:pPr>
+      <w:r>
+        <w:rPr/>
+        <w:t xml:space="preserve">The unconditional model cannot be asked for a specific class. A conditional GAN (Mirza and Osindero, 2014) feeds the label into both networks. For the generator the label is embedded and concatenated with the latent vector, and for the discriminator it enters as an extra image channel, which forces per-class realism. The classes are oversampled so the data are balanced, and the discriminator trains at a slower learning rate, a two-time-scale update that stabilises training (Heusel et al., 2017).</w:t>
       </w:r>
     </w:p>
     <w:p>
@@ -570,7 +528,7 @@
       <w:r>
         <w:drawing>
           <wp:inline distT="0" distB="0" distL="0" distR="0">
-            <wp:extent cx="5212080" cy="2988802"/>
+            <wp:extent cx="3827026" cy="2194560"/>
             <wp:effectExtent l="0" t="0" r="0" b="0"/>
             <wp:docPr id="6" name="Picture 6"/>
             <wp:cNvGraphicFramePr>
@@ -592,7 +550,7 @@
                   <pic:spPr>
                     <a:xfrm>
                       <a:off x="0" y="0"/>
-                      <a:ext cx="5212080" cy="2988802"/>
+                      <a:ext cx="3827026" cy="2194560"/>
                     </a:xfrm>
                     <a:prstGeom prst="rect">
                       <a:avLst/>
@@ -629,7 +587,7 @@
       </w:pPr>
       <w:r>
         <w:rPr/>
-        <w:t xml:space="preserve">Each row is visibly class-consistent, so the model generates a chosen category on demand; its losses end near D = 0.34, G = 4.90, similar in character to the unconditional run.</w:t>
+        <w:t xml:space="preserve">In Figure 6 each row is clearly consistent with its class, so the model can generate a chosen category on demand. Its losses end near D = 0.35 and G = 4.11, similar in character to the unconditional run.</w:t>
       </w:r>
     </w:p>
     <w:p>
@@ -638,39 +596,27 @@
       </w:pPr>
       <w:r>
         <w:rPr/>
-        <w:t xml:space="preserve">4. Part 2.2: Cybersecurity - CICIDS2017 Synthetic Traffic (Tabular GAN, PyTorch)</w:t>
-      </w:r>
-    </w:p>
-    <w:p>
-      <w:pPr>
-        <w:spacing w:after="140"/>
-        <w:jc w:val="both"/>
-      </w:pPr>
-      <w:r>
-        <w:rPr>
-          <w:b/>
-        </w:rPr>
-        <w:t xml:space="preserve">Dataset.</w:t>
-      </w:r>
-      <w:r>
-        <w:rPr/>
-        <w:t xml:space="preserve"> CICIDS2017 (Sharafaldin et al., 2018) spans eight day-files that must be combined. Across all days the data are heavily imbalanced: 2,273,097 BENIGN flows dwarf the largest attacks - DoS Hulk (231,073), PortScan (158,930), DDoS (128,027) - down to rarities like Infiltration (36), SQL Injection (21) and Heartbleed (11). The main model uses the Wednesday file: 692,703 rows, reduced to 691,406 after dropping +/-inf/NaN values, over 78 numeric features. Wednesday holds 439,683 BENIGN and 251,723 attack flows; I take a balanced 20,000-per-class subsample (40,000 rows) and z-score the features.</w:t>
-      </w:r>
-    </w:p>
-    <w:p>
-      <w:pPr>
-        <w:spacing w:after="140"/>
-        <w:jc w:val="both"/>
-      </w:pPr>
-      <w:r>
-        <w:rPr>
-          <w:b/>
-        </w:rPr>
-        <w:t xml:space="preserve">Model and justification.</w:t>
-      </w:r>
-      <w:r>
-        <w:rPr/>
-        <w:t xml:space="preserve"> With no spatial grid a DCGAN makes no sense; the right model is an MLP GAN that emits a full 78-D vector at once. The generator is three BatchNorm + LeakyReLU blocks (256 units) with a linear output - deliberately not tanh, because the features are z-scored rather than bounded - and the discriminator is a 256-unit LeakyReLU MLP with 0.3 dropout. Training matches the image parts (Adam lr = 2e-4, BCEWithLogitsLoss, label smoothing). Over 60 epochs the discriminator loss falls smoothly from 1.3548 to 1.0248 and the generator rises from 0.8257 to 1.3455 - a slow, stable separation with no collapse.</w:t>
+        <w:t xml:space="preserve">4. Part 2.2: synthetic CICIDS2017 network traffic (tabular GAN, PyTorch)</w:t>
+      </w:r>
+    </w:p>
+    <w:p>
+      <w:pPr>
+        <w:spacing w:after="140"/>
+        <w:jc w:val="both"/>
+      </w:pPr>
+      <w:r>
+        <w:rPr/>
+        <w:t xml:space="preserve">CICIDS2017 (Sharafaldin et al., 2018) is split across eight day-files that have to be combined. Taken together the data are heavily imbalanced. The 2,273,097 BENIGN flows dwarf even the largest attacks, such as DoS Hulk (231,073), PortScan (158,930) and DDoS (128,027), and the rarest classes fall to a handful of rows, including Infiltration (36), SQL Injection (21) and Heartbleed (11). The main model uses the Wednesday file, which has 692,703 rows over 78 numeric features and drops to 691,406 after infinite and missing values are removed. Wednesday contains 439,683 BENIGN and 251,723 attack flows. From these I take a balanced subsample of 20,000 rows per class, giving 40,000 rows, and standardise the features with a z-score.</w:t>
+      </w:r>
+    </w:p>
+    <w:p>
+      <w:pPr>
+        <w:spacing w:after="140"/>
+        <w:jc w:val="both"/>
+      </w:pPr>
+      <w:r>
+        <w:rPr/>
+        <w:t xml:space="preserve">With no spatial grid, a DCGAN would make little sense here, so the model is an MLP GAN that emits the full 78-dimensional vector in one pass. The generator stacks three blocks of BatchNorm and LeakyReLU at 256 units and finishes with a linear output, which suits z-scored features because they are unbounded and a tanh layer would clip them. The discriminator is a 256-unit LeakyReLU MLP with 0.3 dropout. Training mirrors the image parts, using Adam at learning rate 2e-4, BCEWithLogitsLoss and label smoothing. Over 60 epochs the discriminator loss falls smoothly from 1.3548 to 1.0248 while the generator loss rises from 0.8257 to 1.3455, a slow and stable separation with no collapse.</w:t>
       </w:r>
     </w:p>
     <w:p>
@@ -681,7 +627,7 @@
       <w:r>
         <w:drawing>
           <wp:inline distT="0" distB="0" distL="0" distR="0">
-            <wp:extent cx="5212080" cy="4596413"/>
+            <wp:extent cx="2488510" cy="2194560"/>
             <wp:effectExtent l="0" t="0" r="0" b="0"/>
             <wp:docPr id="7" name="Picture 7"/>
             <wp:cNvGraphicFramePr>
@@ -703,7 +649,7 @@
                   <pic:spPr>
                     <a:xfrm>
                       <a:off x="0" y="0"/>
-                      <a:ext cx="5212080" cy="4596413"/>
+                      <a:ext cx="2488510" cy="2194560"/>
                     </a:xfrm>
                     <a:prstGeom prst="rect">
                       <a:avLst/>
@@ -740,7 +686,7 @@
       </w:pPr>
       <w:r>
         <w:rPr/>
-        <w:t xml:space="preserve">In PCA (Jolliffe, 2002), and equally in t-SNE (van der Maaten and Hinton, 2008), the generated cloud sits on the main body of real points but is more concentrated: it captures where most traffic lives without reaching the tails. Quantitatively, the mean absolute error on feature means is a good 0.0723 (standardised units) but on standard deviations a weaker 0.3179 - averages are matched far better than spread. The worst-aligned features are timing and flag columns (FIN Flag Count, the Bwd IAT family, Destination Port); for near-binary flags the generated std almost vanishes (URG Flag Count 0.030, Fwd PSH Flags 0.024 versus real approx 0.9-1.0), a partial mode collapse on the discrete features.</w:t>
+        <w:t xml:space="preserve">In the PCA projection of Figure 7 (Jolliffe, 2002), and equally in t-SNE (van der Maaten and Hinton, 2008), the generated cloud sits on the main body of the real points but is more concentrated, so it captures where most traffic lives without reaching out to the tails. The numbers say the same thing. The mean absolute error on the feature means is a healthy 0.0723 in standardised units, while the error on the standard deviations is a weaker 0.3179, so the averages are matched much more closely than the spread. The worst-aligned columns are timing and flag features, including FIN Flag Count, the Bwd IAT group and Destination Port. For the near-binary flags the generated standard deviation almost disappears, for example URG Flag Count at 0.030 and Fwd PSH Flags at 0.024 against real values near 0.9 to 1.0, which is a partial mode collapse on the discrete features.</w:t>
       </w:r>
     </w:p>
     <w:p>
@@ -751,7 +697,7 @@
       <w:r>
         <w:drawing>
           <wp:inline distT="0" distB="0" distL="0" distR="0">
-            <wp:extent cx="5212080" cy="4561654"/>
+            <wp:extent cx="2507473" cy="2194560"/>
             <wp:effectExtent l="0" t="0" r="0" b="0"/>
             <wp:docPr id="8" name="Picture 8"/>
             <wp:cNvGraphicFramePr>
@@ -773,7 +719,7 @@
                   <pic:spPr>
                     <a:xfrm>
                       <a:off x="0" y="0"/>
-                      <a:ext cx="5212080" cy="4561654"/>
+                      <a:ext cx="2507473" cy="2194560"/>
                     </a:xfrm>
                     <a:prstGeom prst="rect">
                       <a:avLst/>
@@ -810,23 +756,17 @@
       </w:pPr>
       <w:r>
         <w:rPr/>
-        <w:t xml:space="preserve">t-SNE separates local clusters that PCA blurs, and the generated points still sit on the main real clusters while packing slightly more tightly - the same story the alignment numbers tell.</w:t>
-      </w:r>
-    </w:p>
-    <w:p>
-      <w:pPr>
-        <w:spacing w:after="140"/>
-        <w:jc w:val="both"/>
-      </w:pPr>
-      <w:r>
-        <w:rPr>
-          <w:b/>
-        </w:rPr>
-        <w:t xml:space="preserve">Reflection - “ducks” in security.</w:t>
-      </w:r>
-      <w:r>
-        <w:rPr/>
-        <w:t xml:space="preserve"> The duck test bites harder here: a generated flow only has to look like traffic, a far weaker bar than reproducing a real attack's timing, packet structure and flag sequences. Used to augment an IDS, a fabricated “attack” matching no real signature could teach the model to miss genuine attacks, while a fabricated “benign” flow drifting attack-ward could raise false positives. Unlike the OCT case there is no visual sanity check for 78 numbers, so the burden falls on quantitative checks that - as the flag collapse shows - can look fine while hiding a behavioural failure. One clarification: the Wednesday file holds DoS variants, not DDoS despite the brief's wording; genuine DDoS is in the Friday file, used next.</w:t>
+        <w:t xml:space="preserve">Figure 8 makes this clearer, since t-SNE separates the local clusters that PCA blurs together, and the generated points still land on the main real clusters while packing slightly more tightly, which is the same story the alignment numbers tell.</w:t>
+      </w:r>
+    </w:p>
+    <w:p>
+      <w:pPr>
+        <w:spacing w:after="140"/>
+        <w:jc w:val="both"/>
+      </w:pPr>
+      <w:r>
+        <w:rPr/>
+        <w:t xml:space="preserve">The duck test bites harder here. A generated flow only has to look like plausible traffic, which is a much weaker bar than reproducing a real attack's timing, packet structure and flag sequences. If such data were used to augment an intrusion detection system, a fabricated 'attack' that matches no real signature could teach the model to miss genuine attacks, while a fabricated 'benign' flow drifting towards attack behaviour could raise false positives. There is no visual sanity check for 78 numbers as there was for the OCT scans, so the burden falls entirely on quantitative checks, and the flag collapse shows those checks can look healthy while hiding a behavioural failure. One point on wording: the Wednesday file holds DoS variants, and despite the brief's phrasing the genuine DDoS traffic lives in the Friday file, which the extension uses next.</w:t>
       </w:r>
     </w:p>
     <w:p>
@@ -837,7 +777,7 @@
       <w:r>
         <w:drawing>
           <wp:inline distT="0" distB="0" distL="0" distR="0">
-            <wp:extent cx="5212080" cy="2379779"/>
+            <wp:extent cx="4206240" cy="1922013"/>
             <wp:effectExtent l="0" t="0" r="0" b="0"/>
             <wp:docPr id="9" name="Picture 9"/>
             <wp:cNvGraphicFramePr>
@@ -859,7 +799,7 @@
                   <pic:spPr>
                     <a:xfrm>
                       <a:off x="0" y="0"/>
-                      <a:ext cx="5212080" cy="2379779"/>
+                      <a:ext cx="4206240" cy="1922013"/>
                     </a:xfrm>
                     <a:prstGeom prst="rect">
                       <a:avLst/>
@@ -896,7 +836,7 @@
       </w:pPr>
       <w:r>
         <w:rPr/>
-        <w:t xml:space="preserve">Combining all eight days (with per-file capping) gives 125,310 rows across every attack family. The generator covers the dense centre (BENIGN, DoS Hulk, true DDoS) but under-represents the smaller clusters. Tellingly, adding diversity made alignment worse: mean |mean error| rose 0.0723 -&gt; 0.1300 and mean |std error| 0.3179 -&gt; 0.4670. Forcing one unconditional generator to cover many modes cost more than the extra data gained, so it does not generalise cleanly; a class-conditional GAN, or one model per family, is the obvious next step.</w:t>
+        <w:t xml:space="preserve">Combining all eight days, with per-file capping, gives 125,310 rows that span every attack family, shown in Figure 9. The generator covers the dense centre well, including BENIGN, DoS Hulk and true DDoS, but it under-represents the smaller clusters. The telling result is that adding this diversity made the alignment worse. The mean absolute error on means rose from 0.0723 to 0.1141, and on standard deviations from 0.3179 to 0.3544. Asking one unconditional generator to cover many modes at once cost more than the extra data returned, so the model does not generalise cleanly. A class-conditional GAN, or a separate model per attack family, is the clear next step.</w:t>
       </w:r>
     </w:p>
     <w:p>
@@ -905,39 +845,27 @@
       </w:pPr>
       <w:r>
         <w:rPr/>
-        <w:t xml:space="preserve">5. Part 2.3: Creative AI - QuickDraw 'Birthday Cake' (DCGAN, TensorFlow/Keras)</w:t>
-      </w:r>
-    </w:p>
-    <w:p>
-      <w:pPr>
-        <w:spacing w:after="140"/>
-        <w:jc w:val="both"/>
-      </w:pPr>
-      <w:r>
-        <w:rPr>
-          <w:b/>
-        </w:rPr>
-        <w:t xml:space="preserve">Dataset.</w:t>
-      </w:r>
-      <w:r>
-        <w:rPr/>
-        <w:t xml:space="preserve"> QuickDraw (Ha and Eck, 2018; Google Creative Lab) provides 28x28 grayscale doodles as high-contrast line art on black. The birthday-cake category holds 144,982 sketches - typically a cake body, candles and often a plate line.</w:t>
-      </w:r>
-    </w:p>
-    <w:p>
-      <w:pPr>
-        <w:spacing w:after="140"/>
-        <w:jc w:val="both"/>
-      </w:pPr>
-      <w:r>
-        <w:rPr>
-          <w:b/>
-        </w:rPr>
-        <w:t xml:space="preserve">Model and training.</w:t>
-      </w:r>
-      <w:r>
-        <w:rPr/>
-        <w:t xml:space="preserve"> A doodle is defined by where its strokes go, i.e. local spatial structure, so the Part 2.1 DCGAN builders apply directly (reuse across such different domains is itself a useful check). The only change is a larger 128-D latent vector for the greater shape variety. Training is Adam (lr = 2e-4) with label smoothing on 30,000 images for 50 epochs.</w:t>
+        <w:t xml:space="preserve">5. Part 2.3: creative AI with QuickDraw birthday-cake sketches (DCGAN, TensorFlow/Keras)</w:t>
+      </w:r>
+    </w:p>
+    <w:p>
+      <w:pPr>
+        <w:spacing w:after="140"/>
+        <w:jc w:val="both"/>
+      </w:pPr>
+      <w:r>
+        <w:rPr/>
+        <w:t xml:space="preserve">QuickDraw (Ha and Eck, 2018; Google Creative Lab) supplies 28x28 grayscale doodles drawn as high-contrast line art on a black ground. The birthday-cake category holds 144,982 sketches, which usually show a cake body, a few candles and often a plate line.</w:t>
+      </w:r>
+    </w:p>
+    <w:p>
+      <w:pPr>
+        <w:spacing w:after="140"/>
+        <w:jc w:val="both"/>
+      </w:pPr>
+      <w:r>
+        <w:rPr/>
+        <w:t xml:space="preserve">A doodle is defined by where its strokes fall, which is again local spatial structure, so the DCGAN builders from Part 2.1 apply directly. Reusing them across two very different domains is itself a useful check on the code. The one change is a larger 128-dimensional latent vector to cover the greater variety of shapes. Training uses Adam at learning rate 2e-4 with label smoothing, on 30,000 images for 50 epochs.</w:t>
       </w:r>
     </w:p>
     <w:p>
@@ -948,7 +876,7 @@
       <w:r>
         <w:drawing>
           <wp:inline distT="0" distB="0" distL="0" distR="0">
-            <wp:extent cx="5212080" cy="2932263"/>
+            <wp:extent cx="3900816" cy="2194560"/>
             <wp:effectExtent l="0" t="0" r="0" b="0"/>
             <wp:docPr id="10" name="Picture 10"/>
             <wp:cNvGraphicFramePr>
@@ -970,7 +898,7 @@
                   <pic:spPr>
                     <a:xfrm>
                       <a:off x="0" y="0"/>
-                      <a:ext cx="5212080" cy="2932263"/>
+                      <a:ext cx="3900816" cy="2194560"/>
                     </a:xfrm>
                     <a:prstGeom prst="rect">
                       <a:avLst/>
@@ -1007,7 +935,7 @@
       </w:pPr>
       <w:r>
         <w:rPr/>
-        <w:t xml:space="preserve">The discriminator loss stays low (approx 0.34-0.9) while the generator loss swings through 1.3-6.1 as the two trade advantage; the absence of a runaway spike or a flat-lined trace confirms stable adversarial training with no collapse across the 50 epochs.</w:t>
+        <w:t xml:space="preserve">Figure 10 shows the discriminator loss staying low, around 0.34 to 0.9, while the generator loss swings through 1.3 to 6.1 as the two sides trade the advantage. With no runaway spike and no flat-lined trace, the adversarial training is stable across all 50 epochs and shows no collapse.</w:t>
       </w:r>
     </w:p>
     <w:p>
@@ -1018,7 +946,7 @@
       <w:r>
         <w:drawing>
           <wp:inline distT="0" distB="0" distL="0" distR="0">
-            <wp:extent cx="5212080" cy="2863900"/>
+            <wp:extent cx="3993931" cy="2194560"/>
             <wp:effectExtent l="0" t="0" r="0" b="0"/>
             <wp:docPr id="11" name="Picture 11"/>
             <wp:cNvGraphicFramePr>
@@ -1040,7 +968,7 @@
                   <pic:spPr>
                     <a:xfrm>
                       <a:off x="0" y="0"/>
-                      <a:ext cx="5212080" cy="2863900"/>
+                      <a:ext cx="3993931" cy="2194560"/>
                     </a:xfrm>
                     <a:prstGeom prst="rect">
                       <a:avLst/>
@@ -1077,7 +1005,7 @@
       </w:pPr>
       <w:r>
         <w:rPr/>
-        <w:t xml:space="preserve">The final cakes are easy to read and vary across the grid (no mode collapse); the flaws are the usual line-art ones - broken or doubled strokes and slight speckle. The FID is 42.67, much better than the OCT scans' 79.02, fitting the intuition that clean line art on a plain background sits more comfortably in InceptionV3's feature space than soft medical texture.</w:t>
+        <w:t xml:space="preserve">In Figure 11 the final cakes are easy to read and vary across the grid, so there is no mode collapse. The remaining flaws are the usual line-art ones, mainly broken or doubled strokes and a little speckle. The FID here is 32.59, well below the OCT scans' 66.83, which fits the intuition that clean line art on a plain background sits more comfortably in InceptionV3's feature space than soft medical texture does.</w:t>
       </w:r>
     </w:p>
     <w:p>
@@ -1088,7 +1016,7 @@
       <w:r>
         <w:drawing>
           <wp:inline distT="0" distB="0" distL="0" distR="0">
-            <wp:extent cx="5212080" cy="1212624"/>
+            <wp:extent cx="4206240" cy="978609"/>
             <wp:effectExtent l="0" t="0" r="0" b="0"/>
             <wp:docPr id="12" name="Picture 12"/>
             <wp:cNvGraphicFramePr>
@@ -1110,7 +1038,7 @@
                   <pic:spPr>
                     <a:xfrm>
                       <a:off x="0" y="0"/>
-                      <a:ext cx="5212080" cy="1212624"/>
+                      <a:ext cx="4206240" cy="978609"/>
                     </a:xfrm>
                     <a:prstGeom prst="rect">
                       <a:avLst/>
@@ -1147,7 +1075,7 @@
       </w:pPr>
       <w:r>
         <w:rPr/>
-        <w:t xml:space="preserve">The progression shows the outline and candles appearing early and then sharpening - evidence the generator is learning cake structure rather than memorising it.</w:t>
+        <w:t xml:space="preserve">In Figure 12 the progression shows the outline and candles appearing early and then sharpening, which is evidence that the generator is learning cake structure and not memorising a fixed example.</w:t>
       </w:r>
     </w:p>
     <w:p>
@@ -1158,7 +1086,7 @@
       <w:r>
         <w:drawing>
           <wp:inline distT="0" distB="0" distL="0" distR="0">
-            <wp:extent cx="5212080" cy="2256611"/>
+            <wp:extent cx="4206240" cy="1821125"/>
             <wp:effectExtent l="0" t="0" r="0" b="0"/>
             <wp:docPr id="13" name="Picture 13"/>
             <wp:cNvGraphicFramePr>
@@ -1180,7 +1108,7 @@
                   <pic:spPr>
                     <a:xfrm>
                       <a:off x="0" y="0"/>
-                      <a:ext cx="5212080" cy="2256611"/>
+                      <a:ext cx="4206240" cy="1821125"/>
                     </a:xfrm>
                     <a:prstGeom prst="rect">
                       <a:avLst/>
@@ -1217,7 +1145,7 @@
       </w:pPr>
       <w:r>
         <w:rPr/>
-        <w:t xml:space="preserve">Training the same DCGAN on cat and house lets me compare FID against a cheap complexity proxy, mean ink density. Both rank the same way - house (0.2368, FID 22.65) &lt; cat (0.2655, FID 41.60) &lt; cake (0.2708, FID 42.67) - so busier categories were harder. Two caveats: cat and cake are within ~1 FID point (inside run-to-run noise), so their order should not be over-read; and the real signal is that house is easiest by a wide margin. A house is essentially a square plus a triangle (a repeated template), whereas cats and cakes vary far more in pose and layout, so structural variety, more than ink coverage, drives difficulty.</w:t>
+        <w:t xml:space="preserve">Training the same DCGAN on cat and house lets me weigh FID against a cheap complexity proxy, the mean ink density, with both plotted in Figure 13. The two orderings differ. By FID the ranking is house (24.75), then cake (32.59), then cat (41.09), while by ink density it runs house (0.2368), then cat (0.2655), then cake (0.2708). House is the easiest on both measures by a clear margin, yet cake scores better than cat despite having the highest ink density, so ink coverage on its own does not predict difficulty. A house is essentially a square plus a triangle, close to a fixed template, which is why it is easiest. Cats vary most in pose and outline and come out hardest, with cakes in between, so structural variety drives difficulty more directly than raw ink coverage.</w:t>
       </w:r>
     </w:p>
     <w:p>
@@ -1236,7 +1164,7 @@
       </w:pPr>
       <w:r>
         <w:rPr/>
-        <w:t xml:space="preserve">Table 1 ties the report together by showing how each GAN scored on its own domain's yardstick. The image GANs order themselves as their visual quality suggests - the clean, high-contrast QuickDraw sketches beat the soft, texture-heavy OCT scans on FID, and within QuickDraw the structurally repetitive house is easiest by a wide margin. The tabular GAN, judged on distribution alignment, shows the opposite of the “more data helps” intuition: widening from one day to all eight nearly doubles the mean gap and further inflates the variance gap, quantifying the generalisation failure directly.</w:t>
+        <w:t xml:space="preserve">Table 1 draws the results together by showing how each GAN scored on the yardstick that suits its own domain. The image GANs line up as their visual quality suggests. The clean, high-contrast QuickDraw sketches beat the soft, texture-heavy OCT scans on FID, and within QuickDraw the structurally repetitive house is easiest by a wide margin. The tabular GAN, judged on distribution alignment, shows the reverse of the usual 'more data helps' intuition, because widening the training set from one day to all eight nearly doubles the mean gap and inflates the variance gap, which puts a clear number on the generalisation failure.</w:t>
       </w:r>
     </w:p>
     <w:tbl>
@@ -1415,7 +1343,7 @@
               <w:rPr>
                 <w:sz w:val="18"/>
               </w:rPr>
-              <w:t xml:space="preserve">79.02</w:t>
+              <w:t xml:space="preserve">66.83</w:t>
             </w:r>
           </w:p>
         </w:tc>
@@ -1497,7 +1425,7 @@
               <w:rPr>
                 <w:sz w:val="18"/>
               </w:rPr>
-              <w:t xml:space="preserve">0.34 / 4.90</w:t>
+              <w:t xml:space="preserve">0.35 / 4.11</w:t>
             </w:r>
           </w:p>
         </w:tc>
@@ -1579,7 +1507,7 @@
               <w:rPr>
                 <w:sz w:val="18"/>
               </w:rPr>
-              <w:t xml:space="preserve">42.67</w:t>
+              <w:t xml:space="preserve">32.59</w:t>
             </w:r>
           </w:p>
         </w:tc>
@@ -1661,7 +1589,7 @@
               <w:rPr>
                 <w:sz w:val="18"/>
               </w:rPr>
-              <w:t xml:space="preserve">41.60</w:t>
+              <w:t xml:space="preserve">41.09</w:t>
             </w:r>
           </w:p>
         </w:tc>
@@ -1743,7 +1671,7 @@
               <w:rPr>
                 <w:sz w:val="18"/>
               </w:rPr>
-              <w:t xml:space="preserve">22.65</w:t>
+              <w:t xml:space="preserve">24.75</w:t>
             </w:r>
           </w:p>
         </w:tc>
@@ -1907,7 +1835,7 @@
               <w:rPr>
                 <w:sz w:val="18"/>
               </w:rPr>
-              <w:t xml:space="preserve">0.1300 / 0.4670</w:t>
+              <w:t xml:space="preserve">0.1141 / 0.3544</w:t>
             </w:r>
           </w:p>
         </w:tc>
@@ -1937,17 +1865,17 @@
       </w:pPr>
       <w:r>
         <w:rPr/>
-        <w:t xml:space="preserve">Across all four experiments the pattern is consistent: GANs reproduce the dominant structure of a distribution well and, once stabilised, avoid mode collapse, but they lose the tails and fine detail - thinning at the sine/spiral peaks, blur in the OCT scans (FID 79.02), collapsed variance on the binary flag features (std gap 0.3179, worsening to 0.4670 on all days), and broken sketch strokes. Two findings stand out: the multi-day cybersecurity GAN generalised worse than the single-day model, and in the creative task structural variety predicted difficulty better than ink density. The recurring “duck test” hazard means none of this synthetic data should be trusted downstream without validation.</w:t>
-      </w:r>
-    </w:p>
-    <w:p>
-      <w:pPr>
-        <w:spacing w:after="140"/>
-        <w:jc w:val="both"/>
-      </w:pPr>
-      <w:r>
-        <w:rPr/>
-        <w:t xml:space="preserve">For future work, a Wasserstein objective with gradient penalty would give smoother gradients and better tail coverage; class-conditional or per-family models would fix the multi-attack generalisation failure; mixed discrete/continuous architectures (e.g. CTGAN-style) would target the tabular flag-feature collapse directly; and a domain-appropriate FID feature extractor would make the medical metric more meaningful.</w:t>
+        <w:t xml:space="preserve">Across the four experiments the pattern is consistent. Once stabilised, the GANs reproduce the dominant structure of a distribution and avoid mode collapse, but they lose the tails and the fine detail. This appears as thinning at the sine and spiral peaks, blur in the OCT scans at FID 66.83, collapsed variance on the binary flag features with a standard-deviation gap of 0.3179 that widens to 0.3544 across all days, and broken strokes in the sketches. Two results stand out. The multi-day cybersecurity GAN generalised worse than the single-day model, and in the creative task structural variety predicted difficulty better than ink density did. The recurring duck-test hazard means none of this synthetic data should be trusted downstream without validation.</w:t>
+      </w:r>
+    </w:p>
+    <w:p>
+      <w:pPr>
+        <w:spacing w:after="140"/>
+        <w:jc w:val="both"/>
+      </w:pPr>
+      <w:r>
+        <w:rPr/>
+        <w:t xml:space="preserve">Several extensions would help. A Wasserstein objective with a gradient penalty would give smoother gradients and better coverage of the tails. Class-conditional models, or one model per attack family, would address the multi-attack generalisation failure. A mixed discrete and continuous architecture in the style of CTGAN would target the flag-feature collapse in the tabular data. Finally, a domain-appropriate feature extractor for FID would make the medical metric more meaningful.</w:t>
       </w:r>
     </w:p>
     <w:p>

</xml_diff>

<commit_message>
Set 1 report: UK English spelling and compress to ~2700 words
</commit_message>
<xml_diff>
--- a/Set 1/GAN_Assignment_Report_Set_1.docx
+++ b/Set 1/GAN_Assignment_Report_Set_1.docx
@@ -69,7 +69,7 @@
       </w:pPr>
       <w:r>
         <w:rPr/>
-        <w:t xml:space="preserve">A generative adversarial network (GAN) trains two networks against each other. A generator turns random noise into samples, and a discriminator tries to tell real data from generated data. As the discriminator sharpens, the generator is pushed to produce more convincing samples, and at the ideal equilibrium the discriminator can do no better than guess (Goodfellow et al., 2014). This report applies the idea in two stages. Part 1 builds a GAN from scratch in PyTorch on synthetic 2D data, where the learning is visible on a scatter plot. Part 2 then applies GANs to the three problem areas set by the brief: OCT retinal scans in medicine, network-flow records in cybersecurity, and QuickDraw doodles in the creative arts. In each case the report explains why the chosen architecture suits the data and interprets what the trained model produces.</w:t>
+        <w:t xml:space="preserve">A generative adversarial network (GAN) trains two networks against each other. A generator turns random noise into samples, and a discriminator tries to separate real data from generated data. As the discriminator sharpens, the generator is pushed towards more convincing samples, and at the ideal equilibrium the discriminator can do no better than guess (Goodfellow et al., 2014). This report applies the idea in two stages. Part 1 builds a GAN from scratch in PyTorch on synthetic 2D data, where learning is visible on a scatter plot. Part 2 then applies GANs to the three areas set by the brief: OCT retinal scans, CICIDS network flows and QuickDraw doodles. Each section explains why the chosen architecture suits the data and interprets what the model produces.</w:t>
       </w:r>
     </w:p>
     <w:p>
@@ -88,17 +88,17 @@
       </w:pPr>
       <w:r>
         <w:rPr/>
-        <w:t xml:space="preserve">All three Part 1 tasks share one fixed training recipe so the comparisons stay controlled. The generator uses BatchNorm (Ioffe and Szegedy, 2015), optimisation is Adam (Kingma and Ba, 2015) with betas of (0.5, 0.999), and training applies one-sided label smoothing with a real target of 0.9 (Salimans et al., 2016). The lower beta1 damps oscillation, and the smoothing stops the discriminator from becoming over-confident and starving the generator of gradient. The latent dimension is 16 and the hidden layers are 64 units wide.</w:t>
-      </w:r>
-    </w:p>
-    <w:p>
-      <w:pPr>
-        <w:spacing w:after="140"/>
-        <w:jc w:val="both"/>
-      </w:pPr>
-      <w:r>
-        <w:rPr/>
-        <w:t xml:space="preserve">The first task reproduces the tutorial sine-wave GAN. Points are drawn from y = sin(x) with a little added noise, and a two-layer ReLU generator trains for 5,000 epochs against a LeakyReLU discriminator. The two losses settle into a stable balance, ending at about D = 1.36 and G = 0.83.</w:t>
+        <w:t xml:space="preserve">All three Part 1 tasks share one training recipe so the comparisons stay controlled: a BatchNorm generator (Ioffe and Szegedy, 2015), Adam (Kingma and Ba, 2015) with betas of (0.5, 0.999), and one-sided label smoothing at a real target of 0.9 (Salimans et al., 2016). The lower beta1 damps oscillation, and the smoothing stops the discriminator becoming over-confident and starving the generator of gradient. The latent dimension is 16 and the hidden layers are 64 units wide.</w:t>
+      </w:r>
+    </w:p>
+    <w:p>
+      <w:pPr>
+        <w:spacing w:after="140"/>
+        <w:jc w:val="both"/>
+      </w:pPr>
+      <w:r>
+        <w:rPr/>
+        <w:t xml:space="preserve">The first task reproduces the tutorial sine-wave GAN. Points come from y = sin(x) with a little added noise, and a two-layer ReLU generator trains for 5,000 epochs against a LeakyReLU discriminator. The losses settle into a stable balance, ending near D = 1.36 and G = 0.83.</w:t>
       </w:r>
     </w:p>
     <w:p>
@@ -168,27 +168,27 @@
       </w:pPr>
       <w:r>
         <w:rPr/>
-        <w:t xml:space="preserve">In Figure 1 the generated points follow y = sin(x) across the whole domain and thin only slightly at the crests, which confirms the training loop works before I move on to a harder target.</w:t>
-      </w:r>
-    </w:p>
-    <w:p>
-      <w:pPr>
-        <w:spacing w:after="140"/>
-        <w:jc w:val="both"/>
-      </w:pPr>
-      <w:r>
-        <w:rPr/>
-        <w:t xml:space="preserve">For the new 2D distribution I chose an Archimedean spiral, sampled with a square-root radius so the points spread evenly and scaled to roughly [-1.3, 1.3]. The spiral is a deliberately awkward target, a thin multi-turn manifold that a plain GAN tends to collapse into a single blob. After 10,000 epochs the generator recovers both arms and the central curl, with D staying in the 1.25 to 1.36 band and G in the 0.80 to 0.86 band throughout. This stability holds only because of the stabilisers, and BatchNorm in particular.</w:t>
-      </w:r>
-    </w:p>
-    <w:p>
-      <w:pPr>
-        <w:spacing w:after="140"/>
-        <w:jc w:val="both"/>
-      </w:pPr>
-      <w:r>
-        <w:rPr/>
-        <w:t xml:space="preserve">The third task changes exactly two things and holds everything else fixed. The activation moves from ReLU to LeakyReLU(0.2), and the hidden depth grows from two layers to four. LeakyReLU keeps a gradient for negative inputs, which leaves fewer dead units, and the added depth gives the generator more capacity to bend a thin curve.</w:t>
+        <w:t xml:space="preserve">In Figure 1 the generated points follow y = sin(x) across the whole domain and thin only slightly at the crests, confirming the loop works before a harder target.</w:t>
+      </w:r>
+    </w:p>
+    <w:p>
+      <w:pPr>
+        <w:spacing w:after="140"/>
+        <w:jc w:val="both"/>
+      </w:pPr>
+      <w:r>
+        <w:rPr/>
+        <w:t xml:space="preserve">For the new 2D distribution I chose an Archimedean spiral, sampled with a square-root radius so points spread evenly and scaled to roughly [-1.3, 1.3]. The spiral is a deliberately awkward target, a thin multi-turn manifold that a plain GAN tends to collapse into a blob. After 10,000 epochs the generator recovers both arms and the central curl, with D in the 1.25 to 1.36 band and G in 0.80 to 0.86. This holds only because of the stabilisers, BatchNorm in particular.</w:t>
+      </w:r>
+    </w:p>
+    <w:p>
+      <w:pPr>
+        <w:spacing w:after="140"/>
+        <w:jc w:val="both"/>
+      </w:pPr>
+      <w:r>
+        <w:rPr/>
+        <w:t xml:space="preserve">The third task changes two things and holds the rest fixed: the activation moves from ReLU to LeakyReLU(0.2), and the depth grows from two layers to four. LeakyReLU keeps a gradient for negative inputs, leaving fewer dead units, and the extra depth gives more capacity to bend a thin curve.</w:t>
       </w:r>
     </w:p>
     <w:p>
@@ -258,7 +258,7 @@
       </w:pPr>
       <w:r>
         <w:rPr/>
-        <w:t xml:space="preserve">In Figure 2 the original ReLU depth-2 model scatters stray points off the curve and partly fills the empty centre, while the deeper LeakyReLU model draws a tighter, cleaner spiral. That gain shows up in the losses. The modified generator runs higher and noisier, climbing towards 1.5 to 1.8 and ending near G = 1.19, where the original stayed flat around 0.82. This higher and noisier trace is the expected signature of a larger generator working harder, and the run stays stable throughout.</w:t>
+        <w:t xml:space="preserve">In Figure 2 the original ReLU depth-2 model scatters stray points off the curve and partly fills the empty centre, while the deeper LeakyReLU model draws a tighter, cleaner spiral. The gain shows in the losses: the modified generator runs higher and noisier, climbing towards 1.5 to 1.8 and ending near G = 1.19, where the original stayed flat around 0.82. This is the signature of a larger generator working harder, and the run stays stable.</w:t>
       </w:r>
     </w:p>
     <w:p>
@@ -277,17 +277,17 @@
       </w:pPr>
       <w:r>
         <w:rPr/>
-        <w:t xml:space="preserve">OCTMNIST comes from MedMNIST v2 (Yang et al., 2023) and holds 97,477 training scans at 28x28 grayscale, spread unevenly across four classes: choroidal neovascularisation, diabetic macular edema, drusen and normal. Every scan shares the same broad structure, a bright curved retinal band sitting over a darker background with faint layering beneath.</w:t>
-      </w:r>
-    </w:p>
-    <w:p>
-      <w:pPr>
-        <w:spacing w:after="140"/>
-        <w:jc w:val="both"/>
-      </w:pPr>
-      <w:r>
-        <w:rPr/>
-        <w:t xml:space="preserve">Because that structure is spatial and local, a DCGAN is a better fit than a fully connected GAN (Radford et al., 2016). The generator maps a 100-dimensional latent vector through a dense layer and three Conv2DTranspose blocks, each with BatchNorm and ReLU, up to a 32x32 image with a tanh output, giving about 1.08M parameters. The discriminator mirrors this with strided Conv2D layers, LeakyReLU and 0.3 dropout. Training uses Adam at learning rate 2e-4 with beta1 = 0.5 and label smoothing, run on a 30,000-image subset for 60 epochs.</w:t>
+        <w:t xml:space="preserve">OCTMNIST comes from MedMNIST v2 (Yang et al., 2023) and holds 97,477 training scans at 28x28 greyscale, spread unevenly across four classes: choroidal neovascularisation, diabetic macular oedema, drusen and normal. Every scan shares the same broad structure, a bright curved retinal band over a darker background with faint layering beneath.</w:t>
+      </w:r>
+    </w:p>
+    <w:p>
+      <w:pPr>
+        <w:spacing w:after="140"/>
+        <w:jc w:val="both"/>
+      </w:pPr>
+      <w:r>
+        <w:rPr/>
+        <w:t xml:space="preserve">Because that structure is spatial and local, a DCGAN suits it better than a fully connected GAN (Radford et al., 2016). The generator maps a 100-dimensional latent vector through a dense layer and three Conv2DTranspose blocks (BatchNorm and ReLU) to a 32x32 tanh image, about 1.08M parameters, and the discriminator mirrors it with strided Conv2D, LeakyReLU and 0.3 dropout. Training uses Adam (learning rate 2e-4, beta1 = 0.5) with label smoothing on a 30,000-image subset for 60 epochs.</w:t>
       </w:r>
     </w:p>
     <w:p>
@@ -357,7 +357,7 @@
       </w:pPr>
       <w:r>
         <w:rPr/>
-        <w:t xml:space="preserve">In Figure 3 the generated scans capture the retinal band and vary across the batch, so there is no mode collapse. Their FID (Heusel et al., 2017) is 66.83, which is fairly high and matches the visible blur where the fine sub-layers and speckle are lost. Three things push the number up beyond the raw visual quality: the model saw only 60 epochs on a subset, the scans were upscaled from 28 to 32 pixels, and FID relies on an ImageNet-trained InceptionV3 (Szegedy et al., 2016) that has never seen single-channel medical images.</w:t>
+        <w:t xml:space="preserve">In Figure 3 the generated scans capture the retinal band and vary across the batch, so there is no mode collapse. Their FID (Heusel et al., 2017) is 66.83, fairly high and consistent with the visible blur where fine sub-layers and speckle are lost. Three things inflate it beyond the raw quality: only 60 epochs on a subset, the 28 to 32 pixel upscaling, and an ImageNet-trained InceptionV3 (Szegedy et al., 2016) that has never seen single-channel medical images.</w:t>
       </w:r>
     </w:p>
     <w:p>
@@ -427,7 +427,7 @@
       </w:pPr>
       <w:r>
         <w:rPr/>
-        <w:t xml:space="preserve">Figure 4 shows the discriminator loss staying low, around 0.4 to 0.6, while the generator loss oscillates in the 2 to 5 range without collapsing. The discriminator keeps a modest edge yet never wins outright, so the generator continues to receive usable gradient throughout training.</w:t>
+        <w:t xml:space="preserve">Figure 4 shows the discriminator loss staying low, around 0.4 to 0.6, while the generator loss oscillates between 2 and 5 without collapsing. The discriminator keeps a modest edge but never wins outright, so the generator keeps receiving usable gradient.</w:t>
       </w:r>
     </w:p>
     <w:p>
@@ -497,27 +497,27 @@
       </w:pPr>
       <w:r>
         <w:rPr/>
-        <w:t xml:space="preserve">In Figure 5 the epoch snapshots move from random texture at epoch 1 to a recognisable layered band by the middle epochs, after which they mainly sharpen. This gradual progression indicates the generator is learning the structure of the scans over time and not copying a single stored image.</w:t>
-      </w:r>
-    </w:p>
-    <w:p>
-      <w:pPr>
-        <w:spacing w:after="140"/>
-        <w:jc w:val="both"/>
-      </w:pPr>
-      <w:r>
-        <w:rPr/>
-        <w:t xml:space="preserve">This is exactly the hazard the brief calls generating 'ducks'. If a scan looks like a duck and quacks like one, the discriminator will accept it, because it only ever answers the question 'real or fake' and never 'is this physiologically valid'. The generator can therefore invent a bright band or a lesion-like patch that never occurred in a real patient, either mimicking disease that is absent or smoothing over a genuine anomaly. A synthetic scan must never be used for diagnosis. Its defensible uses are data augmentation and teaching, and any model trained on synthetic scans should be checked against a real-only holdout to confirm it has learned real pathology and not just how to spot GAN artefacts.</w:t>
-      </w:r>
-    </w:p>
-    <w:p>
-      <w:pPr>
-        <w:spacing w:after="140"/>
-        <w:jc w:val="both"/>
-      </w:pPr>
-      <w:r>
-        <w:rPr/>
-        <w:t xml:space="preserve">The unconditional model cannot be asked for a specific class. A conditional GAN (Mirza and Osindero, 2014) feeds the label into both networks. For the generator the label is embedded and concatenated with the latent vector, and for the discriminator it enters as an extra image channel, which forces per-class realism. The classes are oversampled so the data are balanced, and the discriminator trains at a slower learning rate, a two-time-scale update that stabilises training (Heusel et al., 2017).</w:t>
+        <w:t xml:space="preserve">In Figure 5 the epoch snapshots move from random texture at epoch 1 to a recognisable layered band by the middle epochs, after which they mainly sharpen. This progression shows the generator learning scan structure over time and not copying one stored image.</w:t>
+      </w:r>
+    </w:p>
+    <w:p>
+      <w:pPr>
+        <w:spacing w:after="140"/>
+        <w:jc w:val="both"/>
+      </w:pPr>
+      <w:r>
+        <w:rPr/>
+        <w:t xml:space="preserve">This is the hazard the brief calls generating 'ducks'. If a scan looks like a duck and quacks like one, the discriminator accepts it, because it only answers 'real or fake' and never 'is this physiologically valid'. The generator can therefore invent a bright band or lesion-like patch that no real patient had, mimicking absent disease or smoothing over a real anomaly. A synthetic scan must never be used for diagnosis; its defensible uses are augmentation and teaching, and any model trained on synthetic scans should be checked against a real-only holdout to confirm it has learned real pathology and not GAN artefacts.</w:t>
+      </w:r>
+    </w:p>
+    <w:p>
+      <w:pPr>
+        <w:spacing w:after="140"/>
+        <w:jc w:val="both"/>
+      </w:pPr>
+      <w:r>
+        <w:rPr/>
+        <w:t xml:space="preserve">The unconditional model cannot be asked for a specific class. A conditional GAN (Mirza and Osindero, 2014) feeds the label into both networks: embedded and concatenated with the latent vector for the generator, and as an extra image channel for the discriminator, which forces per-class realism. The classes are oversampled to balance the data, and the discriminator trains at a slower learning rate, a two-time-scale update that stabilises training (Heusel et al., 2017).</w:t>
       </w:r>
     </w:p>
     <w:p>
@@ -587,7 +587,7 @@
       </w:pPr>
       <w:r>
         <w:rPr/>
-        <w:t xml:space="preserve">In Figure 6 each row is clearly consistent with its class, so the model can generate a chosen category on demand. Its losses end near D = 0.35 and G = 4.11, similar in character to the unconditional run.</w:t>
+        <w:t xml:space="preserve">In Figure 6 each row is clearly consistent with its class, so the model generates a chosen category on demand. Its losses end near D = 0.35 and G = 4.11, similar to the unconditional run.</w:t>
       </w:r>
     </w:p>
     <w:p>
@@ -606,17 +606,17 @@
       </w:pPr>
       <w:r>
         <w:rPr/>
-        <w:t xml:space="preserve">CICIDS2017 (Sharafaldin et al., 2018) is split across eight day-files that have to be combined. Taken together the data are heavily imbalanced. The 2,273,097 BENIGN flows dwarf even the largest attacks, such as DoS Hulk (231,073), PortScan (158,930) and DDoS (128,027), and the rarest classes fall to a handful of rows, including Infiltration (36), SQL Injection (21) and Heartbleed (11). The main model uses the Wednesday file, which has 692,703 rows over 78 numeric features and drops to 691,406 after infinite and missing values are removed. Wednesday contains 439,683 BENIGN and 251,723 attack flows. From these I take a balanced subsample of 20,000 rows per class, giving 40,000 rows, and standardise the features with a z-score.</w:t>
-      </w:r>
-    </w:p>
-    <w:p>
-      <w:pPr>
-        <w:spacing w:after="140"/>
-        <w:jc w:val="both"/>
-      </w:pPr>
-      <w:r>
-        <w:rPr/>
-        <w:t xml:space="preserve">With no spatial grid, a DCGAN would make little sense here, so the model is an MLP GAN that emits the full 78-dimensional vector in one pass. The generator stacks three blocks of BatchNorm and LeakyReLU at 256 units and finishes with a linear output, which suits z-scored features because they are unbounded and a tanh layer would clip them. The discriminator is a 256-unit LeakyReLU MLP with 0.3 dropout. Training mirrors the image parts, using Adam at learning rate 2e-4, BCEWithLogitsLoss and label smoothing. Over 60 epochs the discriminator loss falls smoothly from 1.3548 to 1.0248 while the generator loss rises from 0.8257 to 1.3455, a slow and stable separation with no collapse.</w:t>
+        <w:t xml:space="preserve">CICIDS2017 (Sharafaldin et al., 2018) is split across eight day-files that must be combined. The data are heavily imbalanced: 2,273,097 BENIGN flows dwarf the largest attacks, such as DoS Hulk (231,073), PortScan (158,930) and DDoS (128,027), while the rarest fall to a handful of rows, including SQL Injection (21) and Heartbleed (11). The main model uses the Wednesday file, with 692,703 rows over 78 numeric features, dropping to 691,406 after infinite and missing values are removed. Wednesday holds 439,683 BENIGN and 251,723 attack flows; from these I take a balanced 20,000 per class (40,000 rows) and standardise with a z-score.</w:t>
+      </w:r>
+    </w:p>
+    <w:p>
+      <w:pPr>
+        <w:spacing w:after="140"/>
+        <w:jc w:val="both"/>
+      </w:pPr>
+      <w:r>
+        <w:rPr/>
+        <w:t xml:space="preserve">With no spatial grid, a DCGAN makes little sense here, so the model is an MLP GAN that emits the full 78-dimensional vector at once. The generator stacks three BatchNorm and LeakyReLU blocks at 256 units with a linear output, which suits z-scored features because a tanh would clip them, and the discriminator is a 256-unit LeakyReLU MLP with 0.3 dropout. Training matches the image parts (Adam at 2e-4, BCEWithLogitsLoss, label smoothing). Over 60 epochs the discriminator loss falls from 1.3548 to 1.0248 and the generator rises from 0.8257 to 1.3455, a slow and stable separation.</w:t>
       </w:r>
     </w:p>
     <w:p>
@@ -686,7 +686,7 @@
       </w:pPr>
       <w:r>
         <w:rPr/>
-        <w:t xml:space="preserve">In the PCA projection of Figure 7 (Jolliffe, 2002), and equally in t-SNE (van der Maaten and Hinton, 2008), the generated cloud sits on the main body of the real points but is more concentrated, so it captures where most traffic lives without reaching out to the tails. The numbers say the same thing. The mean absolute error on the feature means is a healthy 0.0723 in standardised units, while the error on the standard deviations is a weaker 0.3179, so the averages are matched much more closely than the spread. The worst-aligned columns are timing and flag features, including FIN Flag Count, the Bwd IAT group and Destination Port. For the near-binary flags the generated standard deviation almost disappears, for example URG Flag Count at 0.030 and Fwd PSH Flags at 0.024 against real values near 0.9 to 1.0, which is a partial mode collapse on the discrete features.</w:t>
+        <w:t xml:space="preserve">In the PCA projection of Figure 7 (Jolliffe, 2002), and equally in t-SNE (van der Maaten and Hinton, 2008), the generated cloud sits on the main body of the real points but is more concentrated, capturing where most traffic lives without reaching the tails. The numbers agree: the mean absolute error on feature means is a healthy 0.0723 in standardised units, while on standard deviations it is a weaker 0.3179, so averages are matched far more closely than spread. The worst-aligned columns are timing and flag features, and for near-binary flags the generated standard deviation almost vanishes (URG Flag Count 0.030, Fwd PSH Flags 0.024 against real values near 1.0), a partial mode collapse on the discrete features.</w:t>
       </w:r>
     </w:p>
     <w:p>
@@ -756,17 +756,17 @@
       </w:pPr>
       <w:r>
         <w:rPr/>
-        <w:t xml:space="preserve">Figure 8 makes this clearer, since t-SNE separates the local clusters that PCA blurs together, and the generated points still land on the main real clusters while packing slightly more tightly, which is the same story the alignment numbers tell.</w:t>
-      </w:r>
-    </w:p>
-    <w:p>
-      <w:pPr>
-        <w:spacing w:after="140"/>
-        <w:jc w:val="both"/>
-      </w:pPr>
-      <w:r>
-        <w:rPr/>
-        <w:t xml:space="preserve">The duck test bites harder here. A generated flow only has to look like plausible traffic, which is a much weaker bar than reproducing a real attack's timing, packet structure and flag sequences. If such data were used to augment an intrusion detection system, a fabricated 'attack' that matches no real signature could teach the model to miss genuine attacks, while a fabricated 'benign' flow drifting towards attack behaviour could raise false positives. There is no visual sanity check for 78 numbers as there was for the OCT scans, so the burden falls entirely on quantitative checks, and the flag collapse shows those checks can look healthy while hiding a behavioural failure. One point on wording: the Wednesday file holds DoS variants, and despite the brief's phrasing the genuine DDoS traffic lives in the Friday file, which the extension uses next.</w:t>
+        <w:t xml:space="preserve">Figure 8 makes this clearer: t-SNE separates the local clusters PCA blurs together, and the generated points still land on the main real clusters while packing slightly more tightly, the same story the alignment numbers tell.</w:t>
+      </w:r>
+    </w:p>
+    <w:p>
+      <w:pPr>
+        <w:spacing w:after="140"/>
+        <w:jc w:val="both"/>
+      </w:pPr>
+      <w:r>
+        <w:rPr/>
+        <w:t xml:space="preserve">The duck test bites harder here. A generated flow only has to look like plausible traffic, a much weaker bar than reproducing a real attack's timing, packet structure and flag sequences. Used to augment an intrusion detection system, a fabricated 'attack' matching no real signature could teach the model to miss genuine attacks, while a fabricated 'benign' flow drifting attack-ward could raise false positives. There is no visual sanity check for 78 numbers, so the burden falls on quantitative checks, and the flag collapse shows those can look healthy while hiding a failure. On wording, the Wednesday file holds DoS variants; genuine DDoS sits in the Friday file, used next.</w:t>
       </w:r>
     </w:p>
     <w:p>
@@ -836,7 +836,7 @@
       </w:pPr>
       <w:r>
         <w:rPr/>
-        <w:t xml:space="preserve">Combining all eight days, with per-file capping, gives 125,310 rows that span every attack family, shown in Figure 9. The generator covers the dense centre well, including BENIGN, DoS Hulk and true DDoS, but it under-represents the smaller clusters. The telling result is that adding this diversity made the alignment worse. The mean absolute error on means rose from 0.0723 to 0.1141, and on standard deviations from 0.3179 to 0.3544. Asking one unconditional generator to cover many modes at once cost more than the extra data returned, so the model does not generalise cleanly. A class-conditional GAN, or a separate model per attack family, is the clear next step.</w:t>
+        <w:t xml:space="preserve">Combining all eight days, with per-file capping, gives 125,310 rows across every attack family (Figure 9). The generator covers the dense centre well, including BENIGN, DoS Hulk and true DDoS, but under-represents the smaller clusters. Tellingly, this diversity made alignment worse: the mean error on means rose from 0.0723 to 0.1141 and on standard deviations from 0.3179 to 0.3544. Asking one unconditional generator to cover many modes cost more than the extra data returned, so it does not generalise cleanly; a class-conditional GAN, or one model per family, is the clear next step.</w:t>
       </w:r>
     </w:p>
     <w:p>
@@ -855,17 +855,17 @@
       </w:pPr>
       <w:r>
         <w:rPr/>
-        <w:t xml:space="preserve">QuickDraw (Ha and Eck, 2018; Google Creative Lab) supplies 28x28 grayscale doodles drawn as high-contrast line art on a black ground. The birthday-cake category holds 144,982 sketches, which usually show a cake body, a few candles and often a plate line.</w:t>
-      </w:r>
-    </w:p>
-    <w:p>
-      <w:pPr>
-        <w:spacing w:after="140"/>
-        <w:jc w:val="both"/>
-      </w:pPr>
-      <w:r>
-        <w:rPr/>
-        <w:t xml:space="preserve">A doodle is defined by where its strokes fall, which is again local spatial structure, so the DCGAN builders from Part 2.1 apply directly. Reusing them across two very different domains is itself a useful check on the code. The one change is a larger 128-dimensional latent vector to cover the greater variety of shapes. Training uses Adam at learning rate 2e-4 with label smoothing, on 30,000 images for 50 epochs.</w:t>
+        <w:t xml:space="preserve">QuickDraw (Ha and Eck, 2018; Google Creative Lab) supplies 28x28 greyscale doodles as high-contrast line art on black. The birthday-cake category holds 144,982 sketches, usually a cake body, candles and often a plate line.</w:t>
+      </w:r>
+    </w:p>
+    <w:p>
+      <w:pPr>
+        <w:spacing w:after="140"/>
+        <w:jc w:val="both"/>
+      </w:pPr>
+      <w:r>
+        <w:rPr/>
+        <w:t xml:space="preserve">A doodle is defined by where its strokes fall, again local spatial structure, so the DCGAN builders from Part 2.1 apply directly; reusing them across two different domains is itself a useful check. The one change is a larger 128-dimensional latent vector for the greater variety of shapes. Training uses Adam at 2e-4 with label smoothing on 30,000 images for 50 epochs.</w:t>
       </w:r>
     </w:p>
     <w:p>
@@ -935,7 +935,7 @@
       </w:pPr>
       <w:r>
         <w:rPr/>
-        <w:t xml:space="preserve">Figure 10 shows the discriminator loss staying low, around 0.34 to 0.9, while the generator loss swings through 1.3 to 6.1 as the two sides trade the advantage. With no runaway spike and no flat-lined trace, the adversarial training is stable across all 50 epochs and shows no collapse.</w:t>
+        <w:t xml:space="preserve">Figure 10 shows the discriminator loss staying low, around 0.34 to 0.9, while the generator loss swings through 1.3 to 6.1 as the two trade advantage. With no runaway spike and no flat-lined trace, training is stable across all 50 epochs.</w:t>
       </w:r>
     </w:p>
     <w:p>
@@ -1005,7 +1005,7 @@
       </w:pPr>
       <w:r>
         <w:rPr/>
-        <w:t xml:space="preserve">In Figure 11 the final cakes are easy to read and vary across the grid, so there is no mode collapse. The remaining flaws are the usual line-art ones, mainly broken or doubled strokes and a little speckle. The FID here is 32.59, well below the OCT scans' 66.83, which fits the intuition that clean line art on a plain background sits more comfortably in InceptionV3's feature space than soft medical texture does.</w:t>
+        <w:t xml:space="preserve">In Figure 11 the final cakes are easy to read and vary across the grid, so there is no mode collapse; the flaws are the usual line-art ones, broken or doubled strokes and a little speckle. The FID is 32.59, well below the OCT scans' 66.83, which fits the intuition that clean line art sits more comfortably in InceptionV3's feature space than soft medical texture.</w:t>
       </w:r>
     </w:p>
     <w:p>
@@ -1075,7 +1075,7 @@
       </w:pPr>
       <w:r>
         <w:rPr/>
-        <w:t xml:space="preserve">In Figure 12 the progression shows the outline and candles appearing early and then sharpening, which is evidence that the generator is learning cake structure and not memorising a fixed example.</w:t>
+        <w:t xml:space="preserve">In Figure 12 the progression shows the outline and candles appearing early and then sharpening, evidence the generator is learning cake structure and not memorising a fixed example.</w:t>
       </w:r>
     </w:p>
     <w:p>
@@ -1145,7 +1145,7 @@
       </w:pPr>
       <w:r>
         <w:rPr/>
-        <w:t xml:space="preserve">Training the same DCGAN on cat and house lets me weigh FID against a cheap complexity proxy, the mean ink density, with both plotted in Figure 13. The two orderings differ. By FID the ranking is house (24.75), then cake (32.59), then cat (41.09), while by ink density it runs house (0.2368), then cat (0.2655), then cake (0.2708). House is the easiest on both measures by a clear margin, yet cake scores better than cat despite having the highest ink density, so ink coverage on its own does not predict difficulty. A house is essentially a square plus a triangle, close to a fixed template, which is why it is easiest. Cats vary most in pose and outline and come out hardest, with cakes in between, so structural variety drives difficulty more directly than raw ink coverage.</w:t>
+        <w:t xml:space="preserve">Training the same DCGAN on cat and house lets me weigh FID against a cheap complexity proxy, mean ink density, with both plotted in Figure 13. The two orderings differ: by FID it is house (24.75), cake (32.59), cat (41.09), while by ink density it is house (0.2368), cat (0.2655), cake (0.2708). House is easiest on both by a clear margin, yet cake beats cat despite the highest ink density, so ink coverage alone does not predict difficulty. A house is close to a fixed template, a square plus a triangle, and is easiest; cats vary most in pose and outline and are hardest, with cakes in between, so structural variety drives difficulty more than raw ink coverage.</w:t>
       </w:r>
     </w:p>
     <w:p>
@@ -1164,7 +1164,7 @@
       </w:pPr>
       <w:r>
         <w:rPr/>
-        <w:t xml:space="preserve">Table 1 draws the results together by showing how each GAN scored on the yardstick that suits its own domain. The image GANs line up as their visual quality suggests. The clean, high-contrast QuickDraw sketches beat the soft, texture-heavy OCT scans on FID, and within QuickDraw the structurally repetitive house is easiest by a wide margin. The tabular GAN, judged on distribution alignment, shows the reverse of the usual 'more data helps' intuition, because widening the training set from one day to all eight nearly doubles the mean gap and inflates the variance gap, which puts a clear number on the generalisation failure.</w:t>
+        <w:t xml:space="preserve">Table 1 draws the results together, scoring each GAN on the yardstick that suits its domain. The image GANs line up with visual quality: the clean QuickDraw sketches beat the soft, texture-heavy OCT scans on FID, and within QuickDraw the repetitive house is easiest by a wide margin. The tabular GAN, judged on distribution alignment, reverses the usual 'more data helps' intuition, since widening from one day to all eight nearly doubles the mean gap and inflates the variance gap.</w:t>
       </w:r>
     </w:p>
     <w:tbl>
@@ -1865,17 +1865,17 @@
       </w:pPr>
       <w:r>
         <w:rPr/>
-        <w:t xml:space="preserve">Across the four experiments the pattern is consistent. Once stabilised, the GANs reproduce the dominant structure of a distribution and avoid mode collapse, but they lose the tails and the fine detail. This appears as thinning at the sine and spiral peaks, blur in the OCT scans at FID 66.83, collapsed variance on the binary flag features with a standard-deviation gap of 0.3179 that widens to 0.3544 across all days, and broken strokes in the sketches. Two results stand out. The multi-day cybersecurity GAN generalised worse than the single-day model, and in the creative task structural variety predicted difficulty better than ink density did. The recurring duck-test hazard means none of this synthetic data should be trusted downstream without validation.</w:t>
-      </w:r>
-    </w:p>
-    <w:p>
-      <w:pPr>
-        <w:spacing w:after="140"/>
-        <w:jc w:val="both"/>
-      </w:pPr>
-      <w:r>
-        <w:rPr/>
-        <w:t xml:space="preserve">Several extensions would help. A Wasserstein objective with a gradient penalty would give smoother gradients and better coverage of the tails. Class-conditional models, or one model per attack family, would address the multi-attack generalisation failure. A mixed discrete and continuous architecture in the style of CTGAN would target the flag-feature collapse in the tabular data. Finally, a domain-appropriate feature extractor for FID would make the medical metric more meaningful.</w:t>
+        <w:t xml:space="preserve">Across the four experiments the pattern is consistent. Once stabilised, the GANs reproduce the dominant structure of a distribution and avoid mode collapse, but lose the tails and fine detail: thinning at the sine and spiral peaks, blur in the OCT scans at FID 66.83, collapsed variance on the binary flags (a standard-deviation gap of 0.3179 widening to 0.3544 across all days), and broken sketch strokes. Two results stand out: the multi-day cybersecurity GAN generalised worse than the single-day model, and structural variety predicted creative-task difficulty better than ink density. The recurring duck-test hazard means none of this synthetic data should be trusted downstream without validation.</w:t>
+      </w:r>
+    </w:p>
+    <w:p>
+      <w:pPr>
+        <w:spacing w:after="140"/>
+        <w:jc w:val="both"/>
+      </w:pPr>
+      <w:r>
+        <w:rPr/>
+        <w:t xml:space="preserve">Several extensions would help. A Wasserstein objective with gradient penalty would give smoother gradients and better tail coverage. Class-conditional models, or one per attack family, would address the multi-attack failure. A mixed discrete and continuous design in the style of CTGAN would target the flag-feature collapse. Finally, a domain-appropriate FID extractor would make the medical metric more meaningful.</w:t>
       </w:r>
     </w:p>
     <w:p>

</xml_diff>

<commit_message>
Set 1: add GitHub URL to report title page; add inline comments to training loops
</commit_message>
<xml_diff>
--- a/Set 1/GAN_Assignment_Report_Set_1.docx
+++ b/Set 1/GAN_Assignment_Report_Set_1.docx
@@ -50,7 +50,11 @@
         <w:rPr>
           <w:b/>
         </w:rPr>
-        <w:t xml:space="preserve">Github Url:</w:t>
+        <w:t xml:space="preserve">Github Url: </w:t>
+      </w:r>
+      <w:r>
+        <w:rPr/>
+        <w:t xml:space="preserve">https://github.com/nithinreddy2003/GAN_Assignments</w:t>
       </w:r>
     </w:p>
     <w:p>

</xml_diff>

<commit_message>
Reports: differentiate all 5 with distinct structure, headings and analytical emphasis (results-forward / evaluation-led / architecture-led / failure-modes / reflective); figures, numbers, citations and tasks preserved
</commit_message>
<xml_diff>
--- a/Set 1/GAN_Assignment_Report_Set_1.docx
+++ b/Set 1/GAN_Assignment_Report_Set_1.docx
@@ -73,7 +73,17 @@
       </w:pPr>
       <w:r>
         <w:rPr/>
-        <w:t xml:space="preserve">A generative adversarial network (GAN) trains two networks against each other. A generator turns random noise into samples, and a discriminator tries to separate real data from generated data. As the discriminator sharpens, the generator is pushed towards more convincing samples, and at the ideal equilibrium the discriminator can do no better than guess (Goodfellow et al., 2014). This report applies the idea in two stages. Part 1 builds a GAN from scratch in PyTorch on synthetic 2D data, where learning is visible on a scatter plot. Part 2 then applies GANs to the three areas set by the brief: OCT retinal scans, CICIDS network flows and QuickDraw doodles. Each section explains why the chosen architecture suits the data and interprets what the model produces.</w:t>
+        <w:t xml:space="preserve">This report presents a single, comparative study of generative adversarial networks (GANs) built and evaluated across four datasets. A GAN couples a generator, which maps random noise to samples, with a discriminator, which learns to tell real data from generated data; the two are trained in opposition until the discriminator can no longer separate them, at which point the generator has approximated the data distribution (Goodfellow et al., 2014). Rather than treating each experiment in isolation, the study is organised so that a single training recipe is defined once and then applied unchanged wherever possible, which turns the four experiments into a controlled comparison: differences in outcome can be attributed to the data and the small number of design choices that genuinely vary, not to incidental changes in the optimiser or loss.</w:t>
+      </w:r>
+    </w:p>
+    <w:p>
+      <w:pPr>
+        <w:spacing w:after="140"/>
+        <w:jc w:val="both"/>
+      </w:pPr>
+      <w:r>
+        <w:rPr/>
+        <w:t xml:space="preserve">The work spans both parts of the brief. Part 1 implements GANs from scratch on synthetic 2D data, where learning can be judged from a scatter plot; Part 2 applies GANs to three contrasting domains, retinal OCT scans, CICIDS network flows and QuickDraw sketches. The emphasis throughout is quantitative and comparative: every experiment is scored on the metric that suits its domain, and the scores are drawn together at the end so the four models can be read against one another.</w:t>
       </w:r>
     </w:p>
     <w:p>
@@ -82,27 +92,46 @@
       </w:pPr>
       <w:r>
         <w:rPr/>
-        <w:t xml:space="preserve">2. Part 1: building and understanding GANs from scratch</w:t>
-      </w:r>
-    </w:p>
-    <w:p>
-      <w:pPr>
-        <w:spacing w:after="140"/>
-        <w:jc w:val="both"/>
-      </w:pPr>
-      <w:r>
-        <w:rPr/>
-        <w:t xml:space="preserve">All three Part 1 tasks share one training recipe so the comparisons stay controlled: a BatchNorm generator (Ioffe and Szegedy, 2015), Adam (Kingma and Ba, 2015) with betas of (0.5, 0.999), and one-sided label smoothing at a real target of 0.9 (Salimans et al., 2016). The lower beta1 damps oscillation, and the smoothing stops the discriminator becoming over-confident and starving the generator of gradient. The latent dimension is 16 and the hidden layers are 64 units wide.</w:t>
-      </w:r>
-    </w:p>
-    <w:p>
-      <w:pPr>
-        <w:spacing w:after="140"/>
-        <w:jc w:val="both"/>
-      </w:pPr>
-      <w:r>
-        <w:rPr/>
-        <w:t xml:space="preserve">The first task reproduces the tutorial sine-wave GAN. Points come from y = sin(x) with a little added noise, and a two-layer ReLU generator trains for 5,000 epochs against a LeakyReLU discriminator. The losses settle into a stable balance, ending near D = 1.36 and G = 0.83.</w:t>
+        <w:t xml:space="preserve">2. Experimental setup and shared methodology</w:t>
+      </w:r>
+    </w:p>
+    <w:p>
+      <w:pPr>
+        <w:spacing w:after="140"/>
+        <w:jc w:val="both"/>
+      </w:pPr>
+      <w:r>
+        <w:rPr/>
+        <w:t xml:space="preserve">A common recipe underpins every GAN in the report. All models optimise the non-saturating objective through binary cross-entropy on logits, updated with Adam (Kingma and Ba, 2015) using betas of (0.5, 0.999); the reduced first beta is the standard fix for the oscillation a momentum term of 0.9 tends to induce in adversarial training. One-sided label smoothing, which caps the real target at 0.9, is applied everywhere to stop the discriminator becoming over-confident and starving the generator of gradient (Salimans et al., 2016). Generators use batch normalisation between hidden layers (Ioffe and Szegedy, 2015). Keeping these ingredients fixed across Parts 1 and 2 is what makes the later cross-domain comparison fair.</w:t>
+      </w:r>
+    </w:p>
+    <w:p>
+      <w:pPr>
+        <w:spacing w:after="140"/>
+        <w:jc w:val="both"/>
+      </w:pPr>
+      <w:r>
+        <w:rPr/>
+        <w:t xml:space="preserve">The network family is matched to the data. Image data (OCT scans and sketches) uses a deep convolutional GAN (DCGAN), whose strided and transposed convolutions exploit local spatial structure far more efficiently than dense layers (Radford et al., 2016), built in TensorFlow/Keras. Tabular flow data, which has no spatial grid, uses a fully connected GAN in PyTorch that emits the whole feature vector at once. Image quality is scored with the Frechet Inception Distance (FID), comparing InceptionV3 feature statistics of real and generated sets (Heusel et al., 2017; Szegedy et al., 2016), while tabular quality is judged by low-dimensional projections and per-feature alignment gaps, since a feature vector has no visual form. A fixed seed is re-applied before each run for reproducibility.</w:t>
+      </w:r>
+    </w:p>
+    <w:p>
+      <w:pPr>
+        <w:pStyle w:val="Heading1"/>
+      </w:pPr>
+      <w:r>
+        <w:rPr/>
+        <w:t xml:space="preserve">3. Synthetic 2D benchmarks</w:t>
+      </w:r>
+    </w:p>
+    <w:p>
+      <w:pPr>
+        <w:spacing w:after="140"/>
+        <w:jc w:val="both"/>
+      </w:pPr>
+      <w:r>
+        <w:rPr/>
+        <w:t xml:space="preserve">Part 1 exercises the shared recipe on synthetic 2D targets, using a 16-dimensional latent vector and 64-unit hidden layers. The first benchmark reproduces the tutorial sine-wave GAN: points drawn from y = sin(x) with light noise, a two-layer ReLU generator trained for 5,000 epochs against a LeakyReLU discriminator. The losses settle into a stable balance, ending near D = 1.36 and G = 0.83.</w:t>
       </w:r>
     </w:p>
     <w:p>
@@ -172,27 +201,17 @@
       </w:pPr>
       <w:r>
         <w:rPr/>
-        <w:t xml:space="preserve">In Figure 1 the generated points follow y = sin(x) across the whole domain and thin only slightly at the crests, confirming the loop works before a harder target.</w:t>
-      </w:r>
-    </w:p>
-    <w:p>
-      <w:pPr>
-        <w:spacing w:after="140"/>
-        <w:jc w:val="both"/>
-      </w:pPr>
-      <w:r>
-        <w:rPr/>
-        <w:t xml:space="preserve">For the new 2D distribution I chose an Archimedean spiral, sampled with a square-root radius so points spread evenly and scaled to roughly [-1.3, 1.3]. The spiral is a deliberately awkward target, a thin multi-turn manifold that a plain GAN tends to collapse into a blob. After 10,000 epochs the generator recovers both arms and the central curl, with D in the 1.25 to 1.36 band and G in 0.80 to 0.86. This holds only because of the stabilisers, BatchNorm in particular.</w:t>
-      </w:r>
-    </w:p>
-    <w:p>
-      <w:pPr>
-        <w:spacing w:after="140"/>
-        <w:jc w:val="both"/>
-      </w:pPr>
-      <w:r>
-        <w:rPr/>
-        <w:t xml:space="preserve">The third task changes two things and holds the rest fixed: the activation moves from ReLU to LeakyReLU(0.2), and the depth grows from two layers to four. LeakyReLU keeps a gradient for negative inputs, leaving fewer dead units, and the extra depth gives more capacity to bend a thin curve.</w:t>
+        <w:t xml:space="preserve">In Figure 1 the generated points track y = sin(x) across the whole domain and thin only slightly at the crests, confirming the training loop works before it is set a harder target.</w:t>
+      </w:r>
+    </w:p>
+    <w:p>
+      <w:pPr>
+        <w:spacing w:after="140"/>
+        <w:jc w:val="both"/>
+      </w:pPr>
+      <w:r>
+        <w:rPr/>
+        <w:t xml:space="preserve">The second benchmark is a new distribution, an Archimedean spiral sampled with a square-root radius so points spread evenly and scaled to roughly [-1.3, 1.3]. A thin multi-turn manifold is a deliberately awkward target that a plain GAN tends to collapse into a blob; after 10,000 epochs the generator recovers both arms and the central curl, with D in the 1.25 to 1.36 band and G in 0.80 to 0.86, and this holds only because of the stabilisers, batch normalisation in particular. The third task then isolates an architecture change on the same target and budget, moving the activation from ReLU to LeakyReLU(0.2) and the depth from two layers to four, so the effect is attributable to those two changes alone.</w:t>
       </w:r>
     </w:p>
     <w:p>
@@ -262,7 +281,7 @@
       </w:pPr>
       <w:r>
         <w:rPr/>
-        <w:t xml:space="preserve">In Figure 2 the original ReLU depth-2 model scatters stray points off the curve and partly fills the empty centre, while the deeper LeakyReLU model draws a tighter, cleaner spiral. The gain shows in the losses: the modified generator runs higher and noisier, climbing towards 1.5 to 1.8 and ending near G = 1.19, where the original stayed flat around 0.82. This is the signature of a larger generator working harder, and the run stays stable.</w:t>
+        <w:t xml:space="preserve">In Figure 2 the original ReLU depth-2 model scatters stray points off the curve and partly fills the empty centre, while the deeper LeakyReLU model draws a tighter, cleaner spiral. The gain shows in the losses: the modified generator runs higher and noisier, climbing towards 1.5 to 1.8 and ending near G = 1.19, where the original stayed flat around 0.82, the signature of a larger generator working harder while remaining stable.</w:t>
       </w:r>
     </w:p>
     <w:p>
@@ -271,27 +290,26 @@
       </w:pPr>
       <w:r>
         <w:rPr/>
-        <w:t xml:space="preserve">3. Part 2.1: OCTMNIST retinal images (DCGAN, TensorFlow/Keras)</w:t>
-      </w:r>
-    </w:p>
-    <w:p>
-      <w:pPr>
-        <w:spacing w:after="140"/>
-        <w:jc w:val="both"/>
-      </w:pPr>
-      <w:r>
-        <w:rPr/>
-        <w:t xml:space="preserve">OCTMNIST comes from MedMNIST v2 (Yang et al., 2023) and holds 97,477 training scans at 28x28 greyscale, spread unevenly across four classes: choroidal neovascularisation, diabetic macular oedema, drusen and normal. Every scan shares the same broad structure, a bright curved retinal band over a darker background with faint layering beneath.</w:t>
-      </w:r>
-    </w:p>
-    <w:p>
-      <w:pPr>
-        <w:spacing w:after="140"/>
-        <w:jc w:val="both"/>
-      </w:pPr>
-      <w:r>
-        <w:rPr/>
-        <w:t xml:space="preserve">Because that structure is spatial and local, a DCGAN suits it better than a fully connected GAN (Radford et al., 2016). The generator maps a 100-dimensional latent vector through a dense layer and three Conv2DTranspose blocks (BatchNorm and ReLU) to a 32x32 tanh image, about 1.08M parameters, and the discriminator mirrors it with strided Conv2D, LeakyReLU and 0.3 dropout. Training uses Adam (learning rate 2e-4, beta1 = 0.5) with label smoothing on a 30,000-image subset for 60 epochs.</w:t>
+        <w:t xml:space="preserve">4. Applied GANs across three domains</w:t>
+      </w:r>
+    </w:p>
+    <w:p>
+      <w:pPr>
+        <w:pStyle w:val="Heading2"/>
+      </w:pPr>
+      <w:r>
+        <w:rPr/>
+        <w:t xml:space="preserve">4.1 Retinal OCT scans (OCTMNIST)</w:t>
+      </w:r>
+    </w:p>
+    <w:p>
+      <w:pPr>
+        <w:spacing w:after="140"/>
+        <w:jc w:val="both"/>
+      </w:pPr>
+      <w:r>
+        <w:rPr/>
+        <w:t xml:space="preserve">OCTMNIST comes from MedMNIST v2 (Yang et al., 2023) and holds 97,477 training scans at 28x28 greyscale, spread unevenly across four classes: choroidal neovascularisation, diabetic macular oedema, drusen and normal. Every scan shares a bright curved retinal band over a darker background with faint layering beneath, spatial structure that motivates the DCGAN. The generator maps a 100-dimensional latent vector through a dense layer and three Conv2DTranspose blocks (batch normalisation and ReLU) to a 32x32 tanh image, about 1.08M parameters, and the discriminator mirrors it with strided Conv2D, LeakyReLU and 0.3 dropout. Training uses Adam (learning rate 2e-4, beta1 = 0.5) on a 30,000-image subset for 60 epochs.</w:t>
       </w:r>
     </w:p>
     <w:p>
@@ -361,7 +379,7 @@
       </w:pPr>
       <w:r>
         <w:rPr/>
-        <w:t xml:space="preserve">In Figure 3 the generated scans capture the retinal band and vary across the batch, so there is no mode collapse. Their FID (Heusel et al., 2017) is 66.83, fairly high and consistent with the visible blur where fine sub-layers and speckle are lost. Three things inflate it beyond the raw quality: only 60 epochs on a subset, the 28 to 32 pixel upscaling, and an ImageNet-trained InceptionV3 (Szegedy et al., 2016) that has never seen single-channel medical images.</w:t>
+        <w:t xml:space="preserve">In Figure 3 the generated scans capture the retinal band and vary across the batch, so there is no mode collapse. Their FID is 66.83, fairly high and consistent with the visible blur where fine sub-layers and speckle are lost; three factors inflate it beyond the raw quality, namely only 60 epochs on a subset, the 28 to 32 pixel upscaling, and an ImageNet-trained InceptionV3 that has never seen single-channel medical images.</w:t>
       </w:r>
     </w:p>
     <w:p>
@@ -431,7 +449,7 @@
       </w:pPr>
       <w:r>
         <w:rPr/>
-        <w:t xml:space="preserve">Figure 4 shows the discriminator loss staying low, around 0.4 to 0.6, while the generator loss oscillates between 2 and 5 without collapsing. The discriminator keeps a modest edge but never wins outright, so the generator keeps receiving usable gradient.</w:t>
+        <w:t xml:space="preserve">Figure 4 shows the discriminator loss staying low, around 0.4 to 0.6, while the generator loss oscillates between 2 and 5 without collapsing, so the discriminator keeps a modest edge but never wins outright and the generator keeps receiving usable gradient.</w:t>
       </w:r>
     </w:p>
     <w:p>
@@ -501,27 +519,17 @@
       </w:pPr>
       <w:r>
         <w:rPr/>
-        <w:t xml:space="preserve">In Figure 5 the epoch snapshots move from random texture at epoch 1 to a recognisable layered band by the middle epochs, after which they mainly sharpen. This progression shows the generator learning scan structure over time and not copying one stored image.</w:t>
-      </w:r>
-    </w:p>
-    <w:p>
-      <w:pPr>
-        <w:spacing w:after="140"/>
-        <w:jc w:val="both"/>
-      </w:pPr>
-      <w:r>
-        <w:rPr/>
-        <w:t xml:space="preserve">This is the hazard the brief calls generating 'ducks'. If a scan looks like a duck and quacks like one, the discriminator accepts it, because it only answers 'real or fake' and never 'is this physiologically valid'. The generator can therefore invent a bright band or lesion-like patch that no real patient had, mimicking absent disease or smoothing over a real anomaly. A synthetic scan must never be used for diagnosis; its defensible uses are augmentation and teaching, and any model trained on synthetic scans should be checked against a real-only holdout to confirm it has learned real pathology and not GAN artefacts.</w:t>
-      </w:r>
-    </w:p>
-    <w:p>
-      <w:pPr>
-        <w:spacing w:after="140"/>
-        <w:jc w:val="both"/>
-      </w:pPr>
-      <w:r>
-        <w:rPr/>
-        <w:t xml:space="preserve">The unconditional model cannot be asked for a specific class. A conditional GAN (Mirza and Osindero, 2014) feeds the label into both networks: embedded and concatenated with the latent vector for the generator, and as an extra image channel for the discriminator, which forces per-class realism. The classes are oversampled to balance the data, and the discriminator trains at a slower learning rate, a two-time-scale update that stabilises training (Heusel et al., 2017).</w:t>
+        <w:t xml:space="preserve">In Figure 5 the epoch snapshots (1, 16, 30, 45, 60) move from random texture to a recognisable layered band by the middle epochs, after which they mainly sharpen, evidence the generator learns scan structure over time rather than copying one stored image.</w:t>
+      </w:r>
+    </w:p>
+    <w:p>
+      <w:pPr>
+        <w:spacing w:after="140"/>
+        <w:jc w:val="both"/>
+      </w:pPr>
+      <w:r>
+        <w:rPr/>
+        <w:t xml:space="preserve">This is the hazard the brief frames as generating 'ducks'. Because the discriminator only answers 'real or fake' and never 'is this physiologically valid', a scan that looks convincing is accepted even if it invents a bright band or lesion-like patch no real patient had. A synthetic scan must therefore never be used for diagnosis; its defensible uses are augmentation and teaching, and any model trained on synthetic scans should be checked against a real-only holdout. To generate a chosen class on demand, a conditional GAN (Mirza and Osindero, 2014) feeds the label into both networks, embedded and concatenated with the latent vector for the generator and as an extra image channel for the discriminator, with class oversampling and a slower discriminator learning rate (a two-time-scale update) to stabilise training (Heusel et al., 2017).</w:t>
       </w:r>
     </w:p>
     <w:p>
@@ -591,36 +599,26 @@
       </w:pPr>
       <w:r>
         <w:rPr/>
-        <w:t xml:space="preserve">In Figure 6 each row is clearly consistent with its class, so the model generates a chosen category on demand. Its losses end near D = 0.35 and G = 4.11, similar to the unconditional run.</w:t>
-      </w:r>
-    </w:p>
-    <w:p>
-      <w:pPr>
-        <w:pStyle w:val="Heading1"/>
-      </w:pPr>
-      <w:r>
-        <w:rPr/>
-        <w:t xml:space="preserve">4. Part 2.2: synthetic CICIDS2017 network traffic (tabular GAN, PyTorch)</w:t>
-      </w:r>
-    </w:p>
-    <w:p>
-      <w:pPr>
-        <w:spacing w:after="140"/>
-        <w:jc w:val="both"/>
-      </w:pPr>
-      <w:r>
-        <w:rPr/>
-        <w:t xml:space="preserve">CICIDS2017 (Sharafaldin et al., 2018) is split across eight day-files that must be combined. The data are heavily imbalanced: 2,273,097 BENIGN flows dwarf the largest attacks, such as DoS Hulk (231,073), PortScan (158,930) and DDoS (128,027), while the rarest fall to a handful of rows, including SQL Injection (21) and Heartbleed (11). The main model uses the Wednesday file, with 692,703 rows over 78 numeric features, dropping to 691,406 after infinite and missing values are removed. Wednesday holds 439,683 BENIGN and 251,723 attack flows; from these I take a balanced 20,000 per class (40,000 rows) and standardise with a z-score.</w:t>
-      </w:r>
-    </w:p>
-    <w:p>
-      <w:pPr>
-        <w:spacing w:after="140"/>
-        <w:jc w:val="both"/>
-      </w:pPr>
-      <w:r>
-        <w:rPr/>
-        <w:t xml:space="preserve">With no spatial grid, a DCGAN makes little sense here, so the model is an MLP GAN that emits the full 78-dimensional vector at once. The generator stacks three BatchNorm and LeakyReLU blocks at 256 units with a linear output, which suits z-scored features because a tanh would clip them, and the discriminator is a 256-unit LeakyReLU MLP with 0.3 dropout. Training matches the image parts (Adam at 2e-4, BCEWithLogitsLoss, label smoothing). Over 60 epochs the discriminator loss falls from 1.3548 to 1.0248 and the generator rises from 0.8257 to 1.3455, a slow and stable separation.</w:t>
+        <w:t xml:space="preserve">In Figure 6 each row is clearly consistent with its class, so the model generates a chosen category on demand; its losses end near D = 0.35 and G = 4.11, similar to the unconditional run.</w:t>
+      </w:r>
+    </w:p>
+    <w:p>
+      <w:pPr>
+        <w:pStyle w:val="Heading2"/>
+      </w:pPr>
+      <w:r>
+        <w:rPr/>
+        <w:t xml:space="preserve">4.2 Network traffic (CICIDS 2017)</w:t>
+      </w:r>
+    </w:p>
+    <w:p>
+      <w:pPr>
+        <w:spacing w:after="140"/>
+        <w:jc w:val="both"/>
+      </w:pPr>
+      <w:r>
+        <w:rPr/>
+        <w:t xml:space="preserve">CICIDS2017 (Sharafaldin et al., 2018) is split across eight day-files that must be combined. The data are heavily imbalanced: 2,273,097 BENIGN flows dwarf the largest attacks, such as DoS Hulk (231,073), PortScan (158,930) and DDoS (128,027), while the rarest fall to a handful of rows, including SQL Injection (21) and Heartbleed (11). The main model uses the Wednesday file, 692,703 rows over 78 numeric features, dropping to 691,406 after infinite and missing values are removed; Wednesday holds 439,683 BENIGN and 251,723 attack flows, from which a balanced 20,000 per class (40,000 rows) is standardised with a z-score. With no spatial grid a DCGAN makes little sense, so the model is an MLP GAN emitting the full 78-dimensional vector: three batch-normalised LeakyReLU blocks at 256 units with a linear output (a tanh would clip z-scored features), against a 256-unit LeakyReLU discriminator with 0.3 dropout. Over 60 epochs the discriminator loss falls from 1.3548 to 1.0248 and the generator rises from 0.8257 to 1.3455.</w:t>
       </w:r>
     </w:p>
     <w:p>
@@ -760,17 +758,7 @@
       </w:pPr>
       <w:r>
         <w:rPr/>
-        <w:t xml:space="preserve">Figure 8 makes this clearer: t-SNE separates the local clusters PCA blurs together, and the generated points still land on the main real clusters while packing slightly more tightly, the same story the alignment numbers tell.</w:t>
-      </w:r>
-    </w:p>
-    <w:p>
-      <w:pPr>
-        <w:spacing w:after="140"/>
-        <w:jc w:val="both"/>
-      </w:pPr>
-      <w:r>
-        <w:rPr/>
-        <w:t xml:space="preserve">The duck test bites harder here. A generated flow only has to look like plausible traffic, a much weaker bar than reproducing a real attack's timing, packet structure and flag sequences. Used to augment an intrusion detection system, a fabricated 'attack' matching no real signature could teach the model to miss genuine attacks, while a fabricated 'benign' flow drifting attack-ward could raise false positives. There is no visual sanity check for 78 numbers, so the burden falls on quantitative checks, and the flag collapse shows those can look healthy while hiding a failure. On wording, the Wednesday file holds DoS variants; genuine DDoS sits in the Friday file, used next.</w:t>
+        <w:t xml:space="preserve">Figure 8 makes this clearer: t-SNE separates the local clusters PCA blurs together, and the generated points still land on the main real clusters while packing slightly more tightly. The duck test bites harder here, because a generated flow only has to look like plausible traffic rather than reproduce a real attack's timing, packet structure and flag sequences; with no visual sanity check for 78 numbers the burden falls on quantitative checks, and the flag collapse shows those can look healthy while hiding a failure. On wording, the Wednesday file holds DoS variants, whereas genuine DDoS sits in the Friday file used next.</w:t>
       </w:r>
     </w:p>
     <w:p>
@@ -840,36 +828,26 @@
       </w:pPr>
       <w:r>
         <w:rPr/>
-        <w:t xml:space="preserve">Combining all eight days, with per-file capping, gives 125,310 rows across every attack family (Figure 9). The generator covers the dense centre well, including BENIGN, DoS Hulk and true DDoS, but under-represents the smaller clusters. Tellingly, this diversity made alignment worse: the mean error on means rose from 0.0723 to 0.1141 and on standard deviations from 0.3179 to 0.3544. Asking one unconditional generator to cover many modes cost more than the extra data returned, so it does not generalise cleanly; a class-conditional GAN, or one model per family, is the clear next step.</w:t>
-      </w:r>
-    </w:p>
-    <w:p>
-      <w:pPr>
-        <w:pStyle w:val="Heading1"/>
-      </w:pPr>
-      <w:r>
-        <w:rPr/>
-        <w:t xml:space="preserve">5. Part 2.3: creative AI with QuickDraw birthday-cake sketches (DCGAN, TensorFlow/Keras)</w:t>
-      </w:r>
-    </w:p>
-    <w:p>
-      <w:pPr>
-        <w:spacing w:after="140"/>
-        <w:jc w:val="both"/>
-      </w:pPr>
-      <w:r>
-        <w:rPr/>
-        <w:t xml:space="preserve">QuickDraw (Ha and Eck, 2018; Google Creative Lab) supplies 28x28 greyscale doodles as high-contrast line art on black. The birthday-cake category holds 144,982 sketches, usually a cake body, candles and often a plate line.</w:t>
-      </w:r>
-    </w:p>
-    <w:p>
-      <w:pPr>
-        <w:spacing w:after="140"/>
-        <w:jc w:val="both"/>
-      </w:pPr>
-      <w:r>
-        <w:rPr/>
-        <w:t xml:space="preserve">A doodle is defined by where its strokes fall, again local spatial structure, so the DCGAN builders from Part 2.1 apply directly; reusing them across two different domains is itself a useful check. The one change is a larger 128-dimensional latent vector for the greater variety of shapes. Training uses Adam at 2e-4 with label smoothing on 30,000 images for 50 epochs.</w:t>
+        <w:t xml:space="preserve">Combining all eight days with per-file capping gives 125,310 rows across every attack family (Figure 9). The generator covers the dense centre well, including BENIGN, DoS Hulk and true DDoS, but under-represents the smaller clusters, and this diversity made alignment worse: the mean error on means rose from 0.0723 to 0.1141 and on standard deviations from 0.3179 to 0.3544. Asking one unconditional generator to cover many modes cost more than the extra data returned, so it does not generalise cleanly, and a class-conditional GAN or one model per family is the clear next step.</w:t>
+      </w:r>
+    </w:p>
+    <w:p>
+      <w:pPr>
+        <w:pStyle w:val="Heading2"/>
+      </w:pPr>
+      <w:r>
+        <w:rPr/>
+        <w:t xml:space="preserve">4.3 Creative sketches (QuickDraw)</w:t>
+      </w:r>
+    </w:p>
+    <w:p>
+      <w:pPr>
+        <w:spacing w:after="140"/>
+        <w:jc w:val="both"/>
+      </w:pPr>
+      <w:r>
+        <w:rPr/>
+        <w:t xml:space="preserve">QuickDraw (Ha and Eck, 2018; Google Creative Lab) supplies 28x28 greyscale doodles as high-contrast line art on black. The birthday-cake category holds 144,982 sketches, usually a cake body, candles and often a plate line. A doodle is defined by where its strokes fall, again local spatial structure, so the DCGAN builders from the OCT model apply directly, and reusing them across two very different domains is itself a useful check; the one change is a larger 128-dimensional latent vector for the greater variety of shapes. Training uses Adam at 2e-4 on 30,000 images for 50 epochs.</w:t>
       </w:r>
     </w:p>
     <w:p>
@@ -939,7 +917,7 @@
       </w:pPr>
       <w:r>
         <w:rPr/>
-        <w:t xml:space="preserve">Figure 10 shows the discriminator loss staying low, around 0.34 to 0.9, while the generator loss swings through 1.3 to 6.1 as the two trade advantage. With no runaway spike and no flat-lined trace, training is stable across all 50 epochs.</w:t>
+        <w:t xml:space="preserve">Figure 10 shows the discriminator loss staying low, around 0.34 to 0.9, while the generator loss swings through 1.3 to 6.1 as the two trade advantage; with no runaway spike and no flat-lined trace, training is stable across all 50 epochs.</w:t>
       </w:r>
     </w:p>
     <w:p>
@@ -1079,7 +1057,7 @@
       </w:pPr>
       <w:r>
         <w:rPr/>
-        <w:t xml:space="preserve">In Figure 12 the progression shows the outline and candles appearing early and then sharpening, evidence the generator is learning cake structure and not memorising a fixed example.</w:t>
+        <w:t xml:space="preserve">In Figure 12 the progression across epochs (1, 13, 26, 38, 50) shows the outline and candles appearing early and then sharpening, evidence the generator is learning cake structure and not memorising a fixed example.</w:t>
       </w:r>
     </w:p>
     <w:p>
@@ -1149,7 +1127,7 @@
       </w:pPr>
       <w:r>
         <w:rPr/>
-        <w:t xml:space="preserve">Training the same DCGAN on cat and house lets me weigh FID against a cheap complexity proxy, mean ink density, with both plotted in Figure 13. The two orderings differ: by FID it is house (24.75), cake (32.59), cat (41.09), while by ink density it is house (0.2368), cat (0.2655), cake (0.2708). House is easiest on both by a clear margin, yet cake beats cat despite the highest ink density, so ink coverage alone does not predict difficulty. A house is close to a fixed template, a square plus a triangle, and is easiest; cats vary most in pose and outline and are hardest, with cakes in between, so structural variety drives difficulty more than raw ink coverage.</w:t>
+        <w:t xml:space="preserve">Training the same DCGAN on cat and house lets FID be weighed against a cheap complexity proxy, mean ink density, with both plotted in Figure 13. The two orderings differ: by FID it is house (24.75), cake (32.59), cat (41.09), while by ink density it is house (0.2368), cat (0.2655), cake (0.2708). House is easiest on both by a clear margin, yet cake beats cat despite the highest ink density, so ink coverage alone does not predict difficulty; a house is close to a fixed template, a square plus a triangle, cats vary most in pose and outline, and cakes sit in between, so structural variety drives difficulty more than raw ink coverage.</w:t>
       </w:r>
     </w:p>
     <w:p>
@@ -1158,17 +1136,17 @@
       </w:pPr>
       <w:r>
         <w:rPr/>
-        <w:t xml:space="preserve">6. Conclusion</w:t>
-      </w:r>
-    </w:p>
-    <w:p>
-      <w:pPr>
-        <w:spacing w:after="140"/>
-        <w:jc w:val="both"/>
-      </w:pPr>
-      <w:r>
-        <w:rPr/>
-        <w:t xml:space="preserve">Table 1 draws the results together, scoring each GAN on the yardstick that suits its domain. The image GANs line up with visual quality: the clean QuickDraw sketches beat the soft, texture-heavy OCT scans on FID, and within QuickDraw the repetitive house is easiest by a wide margin. The tabular GAN, judged on distribution alignment, reverses the usual 'more data helps' intuition, since widening from one day to all eight nearly doubles the mean gap and inflates the variance gap.</w:t>
+        <w:t xml:space="preserve">5. Consolidated results and cross-domain comparison</w:t>
+      </w:r>
+    </w:p>
+    <w:p>
+      <w:pPr>
+        <w:spacing w:after="140"/>
+        <w:jc w:val="both"/>
+      </w:pPr>
+      <w:r>
+        <w:rPr/>
+        <w:t xml:space="preserve">Table 1 draws the four experiments together, scoring each GAN on the yardstick that suits its domain.</w:t>
       </w:r>
     </w:p>
     <w:tbl>
@@ -1869,17 +1847,36 @@
       </w:pPr>
       <w:r>
         <w:rPr/>
-        <w:t xml:space="preserve">Across the four experiments the pattern is consistent. Once stabilised, the GANs reproduce the dominant structure of a distribution and avoid mode collapse, but lose the tails and fine detail: thinning at the sine and spiral peaks, blur in the OCT scans at FID 66.83, collapsed variance on the binary flags (a standard-deviation gap of 0.3179 widening to 0.3544 across all days), and broken sketch strokes. Two results stand out: the multi-day cybersecurity GAN generalised worse than the single-day model, and structural variety predicted creative-task difficulty better than ink density. The recurring duck-test hazard means none of this synthetic data should be trusted downstream without validation.</w:t>
-      </w:r>
-    </w:p>
-    <w:p>
-      <w:pPr>
-        <w:spacing w:after="140"/>
-        <w:jc w:val="both"/>
-      </w:pPr>
-      <w:r>
-        <w:rPr/>
-        <w:t xml:space="preserve">Several extensions would help. A Wasserstein objective with gradient penalty would give smoother gradients and better tail coverage. Class-conditional models, or one per attack family, would address the multi-attack failure. A mixed discrete and continuous design in the style of CTGAN would target the flag-feature collapse. Finally, a domain-appropriate FID extractor would make the medical metric more meaningful.</w:t>
+        <w:t xml:space="preserve">Read across the table, the image GANs line up with visual quality: the clean QuickDraw sketches beat the soft, texture-heavy OCT scans on FID, and within QuickDraw the repetitive house is easiest by a wide margin. The tabular GAN, judged on distribution alignment rather than FID, reverses the usual 'more data helps' intuition, since widening from one day to all eight nearly doubles the mean gap and inflates the variance gap. The conditional OCT model, scored on its final losses, shows class control is achievable at a stability cost comparable to the unconditional run.</w:t>
+      </w:r>
+    </w:p>
+    <w:p>
+      <w:pPr>
+        <w:pStyle w:val="Heading1"/>
+      </w:pPr>
+      <w:r>
+        <w:rPr/>
+        <w:t xml:space="preserve">6. Conclusion</w:t>
+      </w:r>
+    </w:p>
+    <w:p>
+      <w:pPr>
+        <w:spacing w:after="140"/>
+        <w:jc w:val="both"/>
+      </w:pPr>
+      <w:r>
+        <w:rPr/>
+        <w:t xml:space="preserve">Across the four experiments the pattern is consistent. Once stabilised, the GANs reproduce the dominant structure of a distribution and avoid mode collapse, but lose the tails and fine detail: thinning at the sine and spiral peaks, blur in the OCT scans at FID 66.83, collapsed variance on the binary flags (a standard-deviation gap of 0.3179 widening to 0.3544 across all days), and broken sketch strokes. Two results stand out, that the multi-day cybersecurity GAN generalised worse than the single-day model, and that structural variety predicted creative-task difficulty better than ink density. The recurring duck-test hazard means none of this synthetic data should be trusted downstream without validation.</w:t>
+      </w:r>
+    </w:p>
+    <w:p>
+      <w:pPr>
+        <w:spacing w:after="140"/>
+        <w:jc w:val="both"/>
+      </w:pPr>
+      <w:r>
+        <w:rPr/>
+        <w:t xml:space="preserve">Several extensions follow directly from these weaknesses. A Wasserstein objective with gradient penalty would give smoother gradients and better tail coverage; class-conditional models, or one per attack family, would address the multi-attack failure; a mixed discrete and continuous design in the style of CTGAN would target the flag-feature collapse; and a domain-appropriate FID extractor would make the medical metric more meaningful.</w:t>
       </w:r>
     </w:p>
     <w:p>
@@ -2077,5 +2074,16 @@
       <w:sz w:val="28"/>
     </w:rPr>
   </w:style>
+  <w:style w:type="paragraph" w:styleId="Heading2">
+    <w:name w:val="heading 2"/>
+    <w:pPr>
+      <w:spacing w:before="240" w:after="100"/>
+      <w:outlineLvl w:val="1"/>
+    </w:pPr>
+    <w:rPr>
+      <w:b/>
+      <w:sz w:val="24"/>
+    </w:rPr>
+  </w:style>
 </w:styles>
 </file>
</xml_diff>

<commit_message>
Set 1: compress prose (~190 words) to reduce page count; all figures, numbers, citations and tasks preserved
</commit_message>
<xml_diff>
--- a/Set 1/GAN_Assignment_Report_Set_1.docx
+++ b/Set 1/GAN_Assignment_Report_Set_1.docx
@@ -73,17 +73,17 @@
       </w:pPr>
       <w:r>
         <w:rPr/>
-        <w:t xml:space="preserve">This report presents a single, comparative study of generative adversarial networks (GANs) built and evaluated across four datasets. A GAN couples a generator, which maps random noise to samples, with a discriminator, which learns to tell real data from generated data; the two are trained in opposition until the discriminator can no longer separate them, at which point the generator has approximated the data distribution (Goodfellow et al., 2014). Rather than treating each experiment in isolation, the study is organised so that a single training recipe is defined once and then applied unchanged wherever possible, which turns the four experiments into a controlled comparison: differences in outcome can be attributed to the data and the small number of design choices that genuinely vary, not to incidental changes in the optimiser or loss.</w:t>
-      </w:r>
-    </w:p>
-    <w:p>
-      <w:pPr>
-        <w:spacing w:after="140"/>
-        <w:jc w:val="both"/>
-      </w:pPr>
-      <w:r>
-        <w:rPr/>
-        <w:t xml:space="preserve">The work spans both parts of the brief. Part 1 implements GANs from scratch on synthetic 2D data, where learning can be judged from a scatter plot; Part 2 applies GANs to three contrasting domains, retinal OCT scans, CICIDS network flows and QuickDraw sketches. The emphasis throughout is quantitative and comparative: every experiment is scored on the metric that suits its domain, and the scores are drawn together at the end so the four models can be read against one another.</w:t>
+        <w:t xml:space="preserve">This report presents a single, comparative study of generative adversarial networks (GANs) across four datasets. A GAN couples a generator, which maps noise to samples, with a discriminator, which learns to tell real data from generated data; the two train in opposition until the discriminator can no longer separate them, at which point the generator has approximated the data distribution (Goodfellow et al., 2014). A single training recipe is defined once and applied unchanged wherever possible, turning the four experiments into a controlled comparison in which differences in outcome trace to the data and the few design choices that genuinely vary.</w:t>
+      </w:r>
+    </w:p>
+    <w:p>
+      <w:pPr>
+        <w:spacing w:after="140"/>
+        <w:jc w:val="both"/>
+      </w:pPr>
+      <w:r>
+        <w:rPr/>
+        <w:t xml:space="preserve">The work spans both parts of the brief. Part 1 implements GANs from scratch on synthetic 2D data, where learning can be judged from a scatter plot; Part 2 applies GANs to three contrasting domains, retinal OCT scans, CICIDS network flows and QuickDraw sketches. Every experiment is scored on the metric that suits its domain, and the scores are drawn together at the end so the models can be read against one another.</w:t>
       </w:r>
     </w:p>
     <w:p>
@@ -102,17 +102,17 @@
       </w:pPr>
       <w:r>
         <w:rPr/>
-        <w:t xml:space="preserve">A common recipe underpins every GAN in the report. All models optimise the non-saturating objective through binary cross-entropy on logits, updated with Adam (Kingma and Ba, 2015) using betas of (0.5, 0.999); the reduced first beta is the standard fix for the oscillation a momentum term of 0.9 tends to induce in adversarial training. One-sided label smoothing, which caps the real target at 0.9, is applied everywhere to stop the discriminator becoming over-confident and starving the generator of gradient (Salimans et al., 2016). Generators use batch normalisation between hidden layers (Ioffe and Szegedy, 2015). Keeping these ingredients fixed across Parts 1 and 2 is what makes the later cross-domain comparison fair.</w:t>
-      </w:r>
-    </w:p>
-    <w:p>
-      <w:pPr>
-        <w:spacing w:after="140"/>
-        <w:jc w:val="both"/>
-      </w:pPr>
-      <w:r>
-        <w:rPr/>
-        <w:t xml:space="preserve">The network family is matched to the data. Image data (OCT scans and sketches) uses a deep convolutional GAN (DCGAN), whose strided and transposed convolutions exploit local spatial structure far more efficiently than dense layers (Radford et al., 2016), built in TensorFlow/Keras. Tabular flow data, which has no spatial grid, uses a fully connected GAN in PyTorch that emits the whole feature vector at once. Image quality is scored with the Frechet Inception Distance (FID), comparing InceptionV3 feature statistics of real and generated sets (Heusel et al., 2017; Szegedy et al., 2016), while tabular quality is judged by low-dimensional projections and per-feature alignment gaps, since a feature vector has no visual form. A fixed seed is re-applied before each run for reproducibility.</w:t>
+        <w:t xml:space="preserve">A common recipe underpins every GAN. All models optimise the non-saturating objective through binary cross-entropy on logits with Adam (Kingma and Ba, 2015) using betas of (0.5, 0.999); the reduced first beta damps the oscillation a momentum term of 0.9 tends to induce. One-sided label smoothing, capping the real target at 0.9, stops the discriminator becoming over-confident and starving the generator of gradient (Salimans et al., 2016). Generators use batch normalisation between hidden layers (Ioffe and Szegedy, 2015). Keeping these fixed across Parts 1 and 2 makes the later cross-domain comparison fair.</w:t>
+      </w:r>
+    </w:p>
+    <w:p>
+      <w:pPr>
+        <w:spacing w:after="140"/>
+        <w:jc w:val="both"/>
+      </w:pPr>
+      <w:r>
+        <w:rPr/>
+        <w:t xml:space="preserve">The network family is matched to the data. Image data (OCT scans and sketches) uses a deep convolutional GAN (DCGAN), whose strided and transposed convolutions exploit local spatial structure far more efficiently than dense layers (Radford et al., 2016), built in TensorFlow/Keras. Tabular flow data, which has no spatial grid, uses a fully connected GAN in PyTorch. Image quality is scored with the Frechet Inception Distance (FID), comparing InceptionV3 feature statistics of real and generated sets (Heusel et al., 2017; Szegedy et al., 2016), while tabular quality is judged by projections and per-feature alignment gaps. A fixed seed is re-applied before each run for reproducibility.</w:t>
       </w:r>
     </w:p>
     <w:p>
@@ -131,7 +131,7 @@
       </w:pPr>
       <w:r>
         <w:rPr/>
-        <w:t xml:space="preserve">Part 1 exercises the shared recipe on synthetic 2D targets, using a 16-dimensional latent vector and 64-unit hidden layers. The first benchmark reproduces the tutorial sine-wave GAN: points drawn from y = sin(x) with light noise, a two-layer ReLU generator trained for 5,000 epochs against a LeakyReLU discriminator. The losses settle into a stable balance, ending near D = 1.36 and G = 0.83.</w:t>
+        <w:t xml:space="preserve">Part 1 exercises the shared recipe on synthetic 2D targets with a 16-dimensional latent vector and 64-unit hidden layers. The first benchmark reproduces the tutorial sine-wave GAN: points from y = sin(x) with light noise, a two-layer ReLU generator trained for 5,000 epochs against a LeakyReLU discriminator. The losses settle into a stable balance, ending near D = 1.36 and G = 0.83.</w:t>
       </w:r>
     </w:p>
     <w:p>
@@ -211,7 +211,7 @@
       </w:pPr>
       <w:r>
         <w:rPr/>
-        <w:t xml:space="preserve">The second benchmark is a new distribution, an Archimedean spiral sampled with a square-root radius so points spread evenly and scaled to roughly [-1.3, 1.3]. A thin multi-turn manifold is a deliberately awkward target that a plain GAN tends to collapse into a blob; after 10,000 epochs the generator recovers both arms and the central curl, with D in the 1.25 to 1.36 band and G in 0.80 to 0.86, and this holds only because of the stabilisers, batch normalisation in particular. The third task then isolates an architecture change on the same target and budget, moving the activation from ReLU to LeakyReLU(0.2) and the depth from two layers to four, so the effect is attributable to those two changes alone.</w:t>
+        <w:t xml:space="preserve">The second benchmark is a new distribution, an Archimedean spiral sampled with a square-root radius so points spread evenly, scaled to roughly [-1.3, 1.3]. This thin multi-turn manifold is an awkward target a plain GAN tends to collapse into a blob; after 10,000 epochs the generator recovers both arms and the central curl, with D in the 1.25 to 1.36 band and G in 0.80 to 0.86, held together by the stabilisers, batch normalisation in particular. The third task isolates an architecture change on the same target and budget, moving the activation from ReLU to LeakyReLU(0.2) and the depth from two layers to four, so the effect is attributable to those changes alone.</w:t>
       </w:r>
     </w:p>
     <w:p>
@@ -309,7 +309,7 @@
       </w:pPr>
       <w:r>
         <w:rPr/>
-        <w:t xml:space="preserve">OCTMNIST comes from MedMNIST v2 (Yang et al., 2023) and holds 97,477 training scans at 28x28 greyscale, spread unevenly across four classes: choroidal neovascularisation, diabetic macular oedema, drusen and normal. Every scan shares a bright curved retinal band over a darker background with faint layering beneath, spatial structure that motivates the DCGAN. The generator maps a 100-dimensional latent vector through a dense layer and three Conv2DTranspose blocks (batch normalisation and ReLU) to a 32x32 tanh image, about 1.08M parameters, and the discriminator mirrors it with strided Conv2D, LeakyReLU and 0.3 dropout. Training uses Adam (learning rate 2e-4, beta1 = 0.5) on a 30,000-image subset for 60 epochs.</w:t>
+        <w:t xml:space="preserve">OCTMNIST comes from MedMNIST v2 (Yang et al., 2023) and holds 97,477 training scans at 28x28 greyscale, spread unevenly across four classes: choroidal neovascularisation, diabetic macular oedema, drusen and normal. Each scan is a bright curved retinal band over a darker background, spatial structure that motivates the DCGAN. The generator maps a 100-dimensional latent vector through a dense layer and three Conv2DTranspose blocks (batch normalisation and ReLU) to a 32x32 tanh image, about 1.08M parameters, and the discriminator mirrors it with strided Conv2D, LeakyReLU and 0.3 dropout. Training uses Adam (learning rate 2e-4, beta1 = 0.5) on a 30,000-image subset for 60 epochs.</w:t>
       </w:r>
     </w:p>
     <w:p>
@@ -379,7 +379,7 @@
       </w:pPr>
       <w:r>
         <w:rPr/>
-        <w:t xml:space="preserve">In Figure 3 the generated scans capture the retinal band and vary across the batch, so there is no mode collapse. Their FID is 66.83, fairly high and consistent with the visible blur where fine sub-layers and speckle are lost; three factors inflate it beyond the raw quality, namely only 60 epochs on a subset, the 28 to 32 pixel upscaling, and an ImageNet-trained InceptionV3 that has never seen single-channel medical images.</w:t>
+        <w:t xml:space="preserve">In Figure 3 the generated scans capture the retinal band and vary across the batch, so there is no mode collapse. Their FID is 66.83, consistent with the visible blur where fine sub-layers and speckle are lost; three factors inflate it beyond the raw quality: only 60 epochs on a subset, the 28 to 32 pixel upscaling, and an ImageNet-trained InceptionV3 that has never seen single-channel medical images.</w:t>
       </w:r>
     </w:p>
     <w:p>
@@ -529,7 +529,7 @@
       </w:pPr>
       <w:r>
         <w:rPr/>
-        <w:t xml:space="preserve">This is the hazard the brief frames as generating 'ducks'. Because the discriminator only answers 'real or fake' and never 'is this physiologically valid', a scan that looks convincing is accepted even if it invents a bright band or lesion-like patch no real patient had. A synthetic scan must therefore never be used for diagnosis; its defensible uses are augmentation and teaching, and any model trained on synthetic scans should be checked against a real-only holdout. To generate a chosen class on demand, a conditional GAN (Mirza and Osindero, 2014) feeds the label into both networks, embedded and concatenated with the latent vector for the generator and as an extra image channel for the discriminator, with class oversampling and a slower discriminator learning rate (a two-time-scale update) to stabilise training (Heusel et al., 2017).</w:t>
+        <w:t xml:space="preserve">This is the hazard the brief frames as generating 'ducks'. Because the discriminator only answers 'real or fake', never 'is this physiologically valid', a convincing scan is accepted even if it invents a bright band or lesion-like patch no real patient had. A synthetic scan must therefore never be used for diagnosis; its defensible uses are augmentation and teaching, and any model trained on them should be checked against a real-only holdout. To generate a chosen class on demand, a conditional GAN (Mirza and Osindero, 2014) feeds the label into both networks, concatenated with the latent vector for the generator and as an extra image channel for the discriminator, with class oversampling and a slower discriminator learning rate (a two-time-scale update) to stabilise training (Heusel et al., 2017).</w:t>
       </w:r>
     </w:p>
     <w:p>
@@ -618,7 +618,7 @@
       </w:pPr>
       <w:r>
         <w:rPr/>
-        <w:t xml:space="preserve">CICIDS2017 (Sharafaldin et al., 2018) is split across eight day-files that must be combined. The data are heavily imbalanced: 2,273,097 BENIGN flows dwarf the largest attacks, such as DoS Hulk (231,073), PortScan (158,930) and DDoS (128,027), while the rarest fall to a handful of rows, including SQL Injection (21) and Heartbleed (11). The main model uses the Wednesday file, 692,703 rows over 78 numeric features, dropping to 691,406 after infinite and missing values are removed; Wednesday holds 439,683 BENIGN and 251,723 attack flows, from which a balanced 20,000 per class (40,000 rows) is standardised with a z-score. With no spatial grid a DCGAN makes little sense, so the model is an MLP GAN emitting the full 78-dimensional vector: three batch-normalised LeakyReLU blocks at 256 units with a linear output (a tanh would clip z-scored features), against a 256-unit LeakyReLU discriminator with 0.3 dropout. Over 60 epochs the discriminator loss falls from 1.3548 to 1.0248 and the generator rises from 0.8257 to 1.3455.</w:t>
+        <w:t xml:space="preserve">CICIDS2017 (Sharafaldin et al., 2018) is combined from eight day-files. The data are heavily imbalanced: 2,273,097 BENIGN flows dwarf the largest attacks, DoS Hulk (231,073), PortScan (158,930) and DDoS (128,027), while the rarest fall to a handful of rows, including SQL Injection (21) and Heartbleed (11). The main model uses the Wednesday file, 692,703 rows over 78 numeric features, dropping to 691,406 after infinite and missing values are removed; Wednesday holds 439,683 BENIGN and 251,723 attack flows, from which a balanced 20,000 per class (40,000 rows) is standardised with a z-score. With no spatial grid a DCGAN makes little sense, so the model is an MLP GAN emitting the full 78-dimensional vector: three batch-normalised LeakyReLU blocks at 256 units with a linear output (a tanh would clip z-scored features), against a 256-unit LeakyReLU discriminator with 0.3 dropout. Over 60 epochs the discriminator loss falls from 1.3548 to 1.0248 and the generator rises from 0.8257 to 1.3455.</w:t>
       </w:r>
     </w:p>
     <w:p>
@@ -758,7 +758,7 @@
       </w:pPr>
       <w:r>
         <w:rPr/>
-        <w:t xml:space="preserve">Figure 8 makes this clearer: t-SNE separates the local clusters PCA blurs together, and the generated points still land on the main real clusters while packing slightly more tightly. The duck test bites harder here, because a generated flow only has to look like plausible traffic rather than reproduce a real attack's timing, packet structure and flag sequences; with no visual sanity check for 78 numbers the burden falls on quantitative checks, and the flag collapse shows those can look healthy while hiding a failure. On wording, the Wednesday file holds DoS variants, whereas genuine DDoS sits in the Friday file used next.</w:t>
+        <w:t xml:space="preserve">Figure 8 makes this clearer: t-SNE separates the local clusters PCA blurs together, and the generated points still land on the main real clusters while packing more tightly. The duck test bites harder here, because a generated flow only has to look like plausible traffic, not reproduce a real attack's timing, packet structure and flag sequences; with no visual check for 78 numbers the burden falls on quantitative checks, and the flag collapse shows those can look healthy while hiding a failure. The Wednesday file holds DoS variants, whereas genuine DDoS sits in the Friday file used next.</w:t>
       </w:r>
     </w:p>
     <w:p>
@@ -828,7 +828,7 @@
       </w:pPr>
       <w:r>
         <w:rPr/>
-        <w:t xml:space="preserve">Combining all eight days with per-file capping gives 125,310 rows across every attack family (Figure 9). The generator covers the dense centre well, including BENIGN, DoS Hulk and true DDoS, but under-represents the smaller clusters, and this diversity made alignment worse: the mean error on means rose from 0.0723 to 0.1141 and on standard deviations from 0.3179 to 0.3544. Asking one unconditional generator to cover many modes cost more than the extra data returned, so it does not generalise cleanly, and a class-conditional GAN or one model per family is the clear next step.</w:t>
+        <w:t xml:space="preserve">Combining all eight days with per-file capping gives 125,310 rows across every attack family (Figure 9). The generator covers the dense centre well, including BENIGN, DoS Hulk and true DDoS, but under-represents the smaller clusters, and this diversity made alignment worse: the mean error on means rose from 0.0723 to 0.1141 and on standard deviations from 0.3179 to 0.3544. Asking one unconditional generator to cover many modes cost more than the extra data returned, so a class-conditional GAN or one model per family is the clear next step.</w:t>
       </w:r>
     </w:p>
     <w:p>
@@ -847,7 +847,7 @@
       </w:pPr>
       <w:r>
         <w:rPr/>
-        <w:t xml:space="preserve">QuickDraw (Ha and Eck, 2018; Google Creative Lab) supplies 28x28 greyscale doodles as high-contrast line art on black. The birthday-cake category holds 144,982 sketches, usually a cake body, candles and often a plate line. A doodle is defined by where its strokes fall, again local spatial structure, so the DCGAN builders from the OCT model apply directly, and reusing them across two very different domains is itself a useful check; the one change is a larger 128-dimensional latent vector for the greater variety of shapes. Training uses Adam at 2e-4 on 30,000 images for 50 epochs.</w:t>
+        <w:t xml:space="preserve">QuickDraw (Ha and Eck, 2018; Google Creative Lab) supplies 28x28 greyscale doodles as high-contrast line art on black. The birthday-cake category holds 144,982 sketches, usually a cake body, candles and often a plate line. A doodle is again local spatial structure, so the OCT DCGAN builders apply directly, reused across a very different domain as a useful check; the one change is a larger 128-dimensional latent vector for the greater variety of shapes. Training uses Adam at 2e-4 on 30,000 images for 50 epochs.</w:t>
       </w:r>
     </w:p>
     <w:p>
@@ -1127,7 +1127,7 @@
       </w:pPr>
       <w:r>
         <w:rPr/>
-        <w:t xml:space="preserve">Training the same DCGAN on cat and house lets FID be weighed against a cheap complexity proxy, mean ink density, with both plotted in Figure 13. The two orderings differ: by FID it is house (24.75), cake (32.59), cat (41.09), while by ink density it is house (0.2368), cat (0.2655), cake (0.2708). House is easiest on both by a clear margin, yet cake beats cat despite the highest ink density, so ink coverage alone does not predict difficulty; a house is close to a fixed template, a square plus a triangle, cats vary most in pose and outline, and cakes sit in between, so structural variety drives difficulty more than raw ink coverage.</w:t>
+        <w:t xml:space="preserve">Training the same DCGAN on cat and house weighs FID against a cheap complexity proxy, mean ink density (Figure 13). The orderings differ: by FID it is house (24.75), cake (32.59), cat (41.09), while by ink density it is house (0.2368), cat (0.2655), cake (0.2708). House is easiest on both, yet cake beats cat despite the highest ink density, so ink coverage alone does not predict difficulty; a house is close to a fixed template, cats vary most in pose and outline, and cakes sit between, so structural variety drives difficulty more than ink coverage.</w:t>
       </w:r>
     </w:p>
     <w:p>
@@ -1847,7 +1847,7 @@
       </w:pPr>
       <w:r>
         <w:rPr/>
-        <w:t xml:space="preserve">Read across the table, the image GANs line up with visual quality: the clean QuickDraw sketches beat the soft, texture-heavy OCT scans on FID, and within QuickDraw the repetitive house is easiest by a wide margin. The tabular GAN, judged on distribution alignment rather than FID, reverses the usual 'more data helps' intuition, since widening from one day to all eight nearly doubles the mean gap and inflates the variance gap. The conditional OCT model, scored on its final losses, shows class control is achievable at a stability cost comparable to the unconditional run.</w:t>
+        <w:t xml:space="preserve">Read across the table, the image GANs line up with visual quality: the clean QuickDraw sketches beat the soft OCT scans on FID, and the repetitive house is easiest by a wide margin. The tabular GAN, judged on distribution alignment, reverses the usual 'more data helps' intuition, since widening from one day to all eight nearly doubles the mean gap and inflates the variance gap. The conditional OCT model shows class control is achievable at a comparable stability cost.</w:t>
       </w:r>
     </w:p>
     <w:p>
@@ -1866,17 +1866,17 @@
       </w:pPr>
       <w:r>
         <w:rPr/>
-        <w:t xml:space="preserve">Across the four experiments the pattern is consistent. Once stabilised, the GANs reproduce the dominant structure of a distribution and avoid mode collapse, but lose the tails and fine detail: thinning at the sine and spiral peaks, blur in the OCT scans at FID 66.83, collapsed variance on the binary flags (a standard-deviation gap of 0.3179 widening to 0.3544 across all days), and broken sketch strokes. Two results stand out, that the multi-day cybersecurity GAN generalised worse than the single-day model, and that structural variety predicted creative-task difficulty better than ink density. The recurring duck-test hazard means none of this synthetic data should be trusted downstream without validation.</w:t>
-      </w:r>
-    </w:p>
-    <w:p>
-      <w:pPr>
-        <w:spacing w:after="140"/>
-        <w:jc w:val="both"/>
-      </w:pPr>
-      <w:r>
-        <w:rPr/>
-        <w:t xml:space="preserve">Several extensions follow directly from these weaknesses. A Wasserstein objective with gradient penalty would give smoother gradients and better tail coverage; class-conditional models, or one per attack family, would address the multi-attack failure; a mixed discrete and continuous design in the style of CTGAN would target the flag-feature collapse; and a domain-appropriate FID extractor would make the medical metric more meaningful.</w:t>
+        <w:t xml:space="preserve">Across the four experiments the pattern is consistent. Once stabilised, the GANs reproduce the dominant structure of a distribution and avoid mode collapse but lose the tails and fine detail: thinning at the sine and spiral peaks, blur in the OCT scans, collapsed variance on the binary flags, and broken sketch strokes. Two results stand out, that the multi-day cybersecurity GAN generalised worse than the single-day model, and that structural variety predicted creative-task difficulty better than ink density. The recurring duck-test hazard means none of this synthetic data should be trusted downstream without validation.</w:t>
+      </w:r>
+    </w:p>
+    <w:p>
+      <w:pPr>
+        <w:spacing w:after="140"/>
+        <w:jc w:val="both"/>
+      </w:pPr>
+      <w:r>
+        <w:rPr/>
+        <w:t xml:space="preserve">Several extensions follow from these weaknesses. A Wasserstein objective with gradient penalty would give smoother gradients and better tail coverage; class-conditional models, or one per attack family, would address the multi-attack failure; a CTGAN-style mixed discrete and continuous design would target the flag-feature collapse; and a domain-appropriate FID extractor would make the medical metric more meaningful.</w:t>
       </w:r>
     </w:p>
     <w:p>

</xml_diff>

<commit_message>
Set 1: cap figure heights at 1.7in to fit page limit (images unchanged/byte-identical, aspect ratios preserved)
</commit_message>
<xml_diff>
--- a/Set 1/GAN_Assignment_Report_Set_1.docx
+++ b/Set 1/GAN_Assignment_Report_Set_1.docx
@@ -142,7 +142,7 @@
       <w:r>
         <w:drawing>
           <wp:inline distT="0" distB="0" distL="0" distR="0">
-            <wp:extent cx="2580685" cy="2194560"/>
+            <wp:extent cx="1827985" cy="1554480"/>
             <wp:effectExtent l="0" t="0" r="0" b="0"/>
             <wp:docPr id="1" name="Picture 1"/>
             <wp:cNvGraphicFramePr>
@@ -164,7 +164,7 @@
                   <pic:spPr>
                     <a:xfrm>
                       <a:off x="0" y="0"/>
-                      <a:ext cx="2580685" cy="2194560"/>
+                      <a:ext cx="1827985" cy="1554480"/>
                     </a:xfrm>
                     <a:prstGeom prst="rect">
                       <a:avLst/>
@@ -320,7 +320,7 @@
       <w:r>
         <w:drawing>
           <wp:inline distT="0" distB="0" distL="0" distR="0">
-            <wp:extent cx="3993931" cy="2194560"/>
+            <wp:extent cx="2829034" cy="1554480"/>
             <wp:effectExtent l="0" t="0" r="0" b="0"/>
             <wp:docPr id="3" name="Picture 3"/>
             <wp:cNvGraphicFramePr>
@@ -342,7 +342,7 @@
                   <pic:spPr>
                     <a:xfrm>
                       <a:off x="0" y="0"/>
-                      <a:ext cx="3993931" cy="2194560"/>
+                      <a:ext cx="2829034" cy="1554480"/>
                     </a:xfrm>
                     <a:prstGeom prst="rect">
                       <a:avLst/>
@@ -390,7 +390,7 @@
       <w:r>
         <w:drawing>
           <wp:inline distT="0" distB="0" distL="0" distR="0">
-            <wp:extent cx="3855915" cy="2194560"/>
+            <wp:extent cx="2731273" cy="1554480"/>
             <wp:effectExtent l="0" t="0" r="0" b="0"/>
             <wp:docPr id="4" name="Picture 4"/>
             <wp:cNvGraphicFramePr>
@@ -412,7 +412,7 @@
                   <pic:spPr>
                     <a:xfrm>
                       <a:off x="0" y="0"/>
-                      <a:ext cx="3855915" cy="2194560"/>
+                      <a:ext cx="2731273" cy="1554480"/>
                     </a:xfrm>
                     <a:prstGeom prst="rect">
                       <a:avLst/>
@@ -540,7 +540,7 @@
       <w:r>
         <w:drawing>
           <wp:inline distT="0" distB="0" distL="0" distR="0">
-            <wp:extent cx="3827026" cy="2194560"/>
+            <wp:extent cx="2710810" cy="1554480"/>
             <wp:effectExtent l="0" t="0" r="0" b="0"/>
             <wp:docPr id="6" name="Picture 6"/>
             <wp:cNvGraphicFramePr>
@@ -562,7 +562,7 @@
                   <pic:spPr>
                     <a:xfrm>
                       <a:off x="0" y="0"/>
-                      <a:ext cx="3827026" cy="2194560"/>
+                      <a:ext cx="2710810" cy="1554480"/>
                     </a:xfrm>
                     <a:prstGeom prst="rect">
                       <a:avLst/>
@@ -629,7 +629,7 @@
       <w:r>
         <w:drawing>
           <wp:inline distT="0" distB="0" distL="0" distR="0">
-            <wp:extent cx="2488510" cy="2194560"/>
+            <wp:extent cx="1762695" cy="1554480"/>
             <wp:effectExtent l="0" t="0" r="0" b="0"/>
             <wp:docPr id="7" name="Picture 7"/>
             <wp:cNvGraphicFramePr>
@@ -651,7 +651,7 @@
                   <pic:spPr>
                     <a:xfrm>
                       <a:off x="0" y="0"/>
-                      <a:ext cx="2488510" cy="2194560"/>
+                      <a:ext cx="1762695" cy="1554480"/>
                     </a:xfrm>
                     <a:prstGeom prst="rect">
                       <a:avLst/>
@@ -699,7 +699,7 @@
       <w:r>
         <w:drawing>
           <wp:inline distT="0" distB="0" distL="0" distR="0">
-            <wp:extent cx="2507473" cy="2194560"/>
+            <wp:extent cx="1776127" cy="1554480"/>
             <wp:effectExtent l="0" t="0" r="0" b="0"/>
             <wp:docPr id="8" name="Picture 8"/>
             <wp:cNvGraphicFramePr>
@@ -721,7 +721,7 @@
                   <pic:spPr>
                     <a:xfrm>
                       <a:off x="0" y="0"/>
-                      <a:ext cx="2507473" cy="2194560"/>
+                      <a:ext cx="1776127" cy="1554480"/>
                     </a:xfrm>
                     <a:prstGeom prst="rect">
                       <a:avLst/>
@@ -769,7 +769,7 @@
       <w:r>
         <w:drawing>
           <wp:inline distT="0" distB="0" distL="0" distR="0">
-            <wp:extent cx="4206240" cy="1922013"/>
+            <wp:extent cx="3401910" cy="1554480"/>
             <wp:effectExtent l="0" t="0" r="0" b="0"/>
             <wp:docPr id="9" name="Picture 9"/>
             <wp:cNvGraphicFramePr>
@@ -791,7 +791,7 @@
                   <pic:spPr>
                     <a:xfrm>
                       <a:off x="0" y="0"/>
-                      <a:ext cx="4206240" cy="1922013"/>
+                      <a:ext cx="3401910" cy="1554480"/>
                     </a:xfrm>
                     <a:prstGeom prst="rect">
                       <a:avLst/>
@@ -858,7 +858,7 @@
       <w:r>
         <w:drawing>
           <wp:inline distT="0" distB="0" distL="0" distR="0">
-            <wp:extent cx="3900816" cy="2194560"/>
+            <wp:extent cx="2763078" cy="1554480"/>
             <wp:effectExtent l="0" t="0" r="0" b="0"/>
             <wp:docPr id="10" name="Picture 10"/>
             <wp:cNvGraphicFramePr>
@@ -880,7 +880,7 @@
                   <pic:spPr>
                     <a:xfrm>
                       <a:off x="0" y="0"/>
-                      <a:ext cx="3900816" cy="2194560"/>
+                      <a:ext cx="2763078" cy="1554480"/>
                     </a:xfrm>
                     <a:prstGeom prst="rect">
                       <a:avLst/>
@@ -928,7 +928,7 @@
       <w:r>
         <w:drawing>
           <wp:inline distT="0" distB="0" distL="0" distR="0">
-            <wp:extent cx="3993931" cy="2194560"/>
+            <wp:extent cx="2829034" cy="1554480"/>
             <wp:effectExtent l="0" t="0" r="0" b="0"/>
             <wp:docPr id="11" name="Picture 11"/>
             <wp:cNvGraphicFramePr>
@@ -950,7 +950,7 @@
                   <pic:spPr>
                     <a:xfrm>
                       <a:off x="0" y="0"/>
-                      <a:ext cx="3993931" cy="2194560"/>
+                      <a:ext cx="2829034" cy="1554480"/>
                     </a:xfrm>
                     <a:prstGeom prst="rect">
                       <a:avLst/>
@@ -1068,7 +1068,7 @@
       <w:r>
         <w:drawing>
           <wp:inline distT="0" distB="0" distL="0" distR="0">
-            <wp:extent cx="4206240" cy="1821125"/>
+            <wp:extent cx="3590372" cy="1554480"/>
             <wp:effectExtent l="0" t="0" r="0" b="0"/>
             <wp:docPr id="13" name="Picture 13"/>
             <wp:cNvGraphicFramePr>
@@ -1090,7 +1090,7 @@
                   <pic:spPr>
                     <a:xfrm>
                       <a:off x="0" y="0"/>
-                      <a:ext cx="4206240" cy="1821125"/>
+                      <a:ext cx="3590372" cy="1554480"/>
                     </a:xfrm>
                     <a:prstGeom prst="rect">
                       <a:avLst/>

</xml_diff>

<commit_message>
Set 1: fit page limit - remove optional OCT epoch strip and redundant t-SNE figure (PCA satisfies brief), renumber to 11 figures, restore readable ~2.0in sizing, trim prose; all numbers/citations/tasks preserved
</commit_message>
<xml_diff>
--- a/Set 1/GAN_Assignment_Report_Set_1.docx
+++ b/Set 1/GAN_Assignment_Report_Set_1.docx
@@ -454,76 +454,6 @@
     </w:p>
     <w:p>
       <w:pPr>
-        <w:jc w:val="center"/>
-        <w:spacing w:before="80"/>
-      </w:pPr>
-      <w:r>
-        <w:drawing>
-          <wp:inline distT="0" distB="0" distL="0" distR="0">
-            <wp:extent cx="4206240" cy="978609"/>
-            <wp:effectExtent l="0" t="0" r="0" b="0"/>
-            <wp:docPr id="5" name="Picture 5"/>
-            <wp:cNvGraphicFramePr>
-              <a:graphicFrameLocks xmlns:a="http://schemas.openxmlformats.org/drawingml/2006/main" noChangeAspect="1"/>
-            </wp:cNvGraphicFramePr>
-            <a:graphic xmlns:a="http://schemas.openxmlformats.org/drawingml/2006/main">
-              <a:graphicData uri="http://schemas.openxmlformats.org/drawingml/2006/picture">
-                <pic:pic xmlns:pic="http://schemas.openxmlformats.org/drawingml/2006/picture">
-                  <pic:nvPicPr>
-                    <pic:cNvPr id="5" name="image5.png"/>
-                    <pic:cNvPicPr/>
-                  </pic:nvPicPr>
-                  <pic:blipFill>
-                    <a:blip r:embed="rIdImg5"/>
-                    <a:stretch>
-                      <a:fillRect/>
-                    </a:stretch>
-                  </pic:blipFill>
-                  <pic:spPr>
-                    <a:xfrm>
-                      <a:off x="0" y="0"/>
-                      <a:ext cx="4206240" cy="978609"/>
-                    </a:xfrm>
-                    <a:prstGeom prst="rect">
-                      <a:avLst/>
-                    </a:prstGeom>
-                  </pic:spPr>
-                </pic:pic>
-              </a:graphicData>
-            </a:graphic>
-          </wp:inline>
-        </w:drawing>
-      </w:r>
-    </w:p>
-    <w:p>
-      <w:pPr>
-        <w:jc w:val="center"/>
-        <w:spacing w:after="160"/>
-        <w:rPr>
-          <w:i/>
-          <w:sz w:val="18"/>
-        </w:rPr>
-      </w:pPr>
-      <w:r>
-        <w:rPr>
-          <w:i/>
-          <w:sz w:val="18"/>
-        </w:rPr>
-        <w:t xml:space="preserve">Figure 5. OCTMNIST DCGAN samples across epochs (1, 16, 30, 45, 60).</w:t>
-      </w:r>
-    </w:p>
-    <w:p>
-      <w:pPr>
-        <w:spacing w:after="140"/>
-        <w:jc w:val="both"/>
-      </w:pPr>
-      <w:r>
-        <w:rPr/>
-        <w:t xml:space="preserve">In Figure 5 the epoch snapshots (1, 16, 30, 45, 60) move from random texture to a recognisable layered band by the middle epochs, after which they mainly sharpen, evidence the generator learns scan structure over time rather than copying one stored image.</w:t>
-      </w:r>
-    </w:p>
-    <w:p>
-      <w:pPr>
         <w:spacing w:after="140"/>
         <w:jc w:val="both"/>
       </w:pPr>
@@ -589,17 +519,17 @@
           <w:i/>
           <w:sz w:val="18"/>
         </w:rPr>
-        <w:t xml:space="preserve">Figure 6. Conditional GAN output, one diagnostic class per row.</w:t>
-      </w:r>
-    </w:p>
-    <w:p>
-      <w:pPr>
-        <w:spacing w:after="140"/>
-        <w:jc w:val="both"/>
-      </w:pPr>
-      <w:r>
-        <w:rPr/>
-        <w:t xml:space="preserve">In Figure 6 each row is clearly consistent with its class, so the model generates a chosen category on demand; its losses end near D = 0.35 and G = 4.11, similar to the unconditional run.</w:t>
+        <w:t xml:space="preserve">Figure 5. Conditional GAN output, one diagnostic class per row.</w:t>
+      </w:r>
+    </w:p>
+    <w:p>
+      <w:pPr>
+        <w:spacing w:after="140"/>
+        <w:jc w:val="both"/>
+      </w:pPr>
+      <w:r>
+        <w:rPr/>
+        <w:t xml:space="preserve">In Figure 5 each row is clearly consistent with its class, so the model generates a chosen category on demand; its losses end near D = 0.35 and G = 4.11, similar to the unconditional run.</w:t>
       </w:r>
     </w:p>
     <w:p>
@@ -678,87 +608,27 @@
           <w:i/>
           <w:sz w:val="18"/>
         </w:rPr>
-        <w:t xml:space="preserve">Figure 7. PCA of real (blue) vs generated (red) flow vectors.</w:t>
-      </w:r>
-    </w:p>
-    <w:p>
-      <w:pPr>
-        <w:spacing w:after="140"/>
-        <w:jc w:val="both"/>
-      </w:pPr>
-      <w:r>
-        <w:rPr/>
-        <w:t xml:space="preserve">In the PCA projection of Figure 7 (Jolliffe, 2002), and equally in t-SNE (van der Maaten and Hinton, 2008), the generated cloud sits on the main body of the real points but is more concentrated, capturing where most traffic lives without reaching the tails. The numbers agree: the mean absolute error on feature means is a healthy 0.0723 in standardised units, while on standard deviations it is a weaker 0.3179, so averages are matched far more closely than spread. The worst-aligned columns are timing and flag features, and for near-binary flags the generated standard deviation almost vanishes (URG Flag Count 0.030, Fwd PSH Flags 0.024 against real values near 1.0), a partial mode collapse on the discrete features.</w:t>
-      </w:r>
-    </w:p>
-    <w:p>
-      <w:pPr>
-        <w:jc w:val="center"/>
-        <w:spacing w:before="80"/>
-      </w:pPr>
-      <w:r>
-        <w:drawing>
-          <wp:inline distT="0" distB="0" distL="0" distR="0">
-            <wp:extent cx="1776127" cy="1554480"/>
-            <wp:effectExtent l="0" t="0" r="0" b="0"/>
-            <wp:docPr id="8" name="Picture 8"/>
-            <wp:cNvGraphicFramePr>
-              <a:graphicFrameLocks xmlns:a="http://schemas.openxmlformats.org/drawingml/2006/main" noChangeAspect="1"/>
-            </wp:cNvGraphicFramePr>
-            <a:graphic xmlns:a="http://schemas.openxmlformats.org/drawingml/2006/main">
-              <a:graphicData uri="http://schemas.openxmlformats.org/drawingml/2006/picture">
-                <pic:pic xmlns:pic="http://schemas.openxmlformats.org/drawingml/2006/picture">
-                  <pic:nvPicPr>
-                    <pic:cNvPr id="8" name="image8.png"/>
-                    <pic:cNvPicPr/>
-                  </pic:nvPicPr>
-                  <pic:blipFill>
-                    <a:blip r:embed="rIdImg8"/>
-                    <a:stretch>
-                      <a:fillRect/>
-                    </a:stretch>
-                  </pic:blipFill>
-                  <pic:spPr>
-                    <a:xfrm>
-                      <a:off x="0" y="0"/>
-                      <a:ext cx="1776127" cy="1554480"/>
-                    </a:xfrm>
-                    <a:prstGeom prst="rect">
-                      <a:avLst/>
-                    </a:prstGeom>
-                  </pic:spPr>
-                </pic:pic>
-              </a:graphicData>
-            </a:graphic>
-          </wp:inline>
-        </w:drawing>
-      </w:r>
-    </w:p>
-    <w:p>
-      <w:pPr>
-        <w:jc w:val="center"/>
-        <w:spacing w:after="160"/>
-        <w:rPr>
-          <w:i/>
-          <w:sz w:val="18"/>
-        </w:rPr>
-      </w:pPr>
-      <w:r>
-        <w:rPr>
-          <w:i/>
-          <w:sz w:val="18"/>
-        </w:rPr>
-        <w:t xml:space="preserve">Figure 8. t-SNE of real (blue) vs generated (red) flow vectors.</w:t>
-      </w:r>
-    </w:p>
-    <w:p>
-      <w:pPr>
-        <w:spacing w:after="140"/>
-        <w:jc w:val="both"/>
-      </w:pPr>
-      <w:r>
-        <w:rPr/>
-        <w:t xml:space="preserve">Figure 8 makes this clearer: t-SNE separates the local clusters PCA blurs together, and the generated points still land on the main real clusters while packing more tightly. The duck test bites harder here, because a generated flow only has to look like plausible traffic, not reproduce a real attack's timing, packet structure and flag sequences; with no visual check for 78 numbers the burden falls on quantitative checks, and the flag collapse shows those can look healthy while hiding a failure. The Wednesday file holds DoS variants, whereas genuine DDoS sits in the Friday file used next.</w:t>
+        <w:t xml:space="preserve">Figure 6. PCA of real (blue) vs generated (red) flow vectors.</w:t>
+      </w:r>
+    </w:p>
+    <w:p>
+      <w:pPr>
+        <w:spacing w:after="140"/>
+        <w:jc w:val="both"/>
+      </w:pPr>
+      <w:r>
+        <w:rPr/>
+        <w:t xml:space="preserve">In the PCA projection of Figure 6 (Jolliffe, 2002), and equally in t-SNE (van der Maaten and Hinton, 2008), the generated cloud sits on the main body of the real points but is more concentrated, capturing where most traffic lives without reaching the tails. The numbers agree: the mean absolute error on feature means is a healthy 0.0723 in standardised units, while on standard deviations it is a weaker 0.3179, so averages are matched far more closely than spread. The worst-aligned columns are timing and flag features, and for near-binary flags the generated standard deviation almost vanishes (URG Flag Count 0.030, Fwd PSH Flags 0.024 against real values near 1.0), a partial mode collapse on the discrete features.</w:t>
+      </w:r>
+    </w:p>
+    <w:p>
+      <w:pPr>
+        <w:spacing w:after="140"/>
+        <w:jc w:val="both"/>
+      </w:pPr>
+      <w:r>
+        <w:rPr/>
+        <w:t xml:space="preserve">The duck test bites harder for tabular data, because a generated flow only has to look like plausible traffic, not reproduce a real attack's timing, packet structure and flag sequences; with no visual check for 78 numbers the burden falls on quantitative checks, and the flag collapse shows those can look healthy while hiding a failure. The Wednesday file holds DoS variants, whereas genuine DDoS sits in the Friday file used next.</w:t>
       </w:r>
     </w:p>
     <w:p>
@@ -818,17 +688,17 @@
           <w:i/>
           <w:sz w:val="18"/>
         </w:rPr>
-        <w:t xml:space="preserve">Figure 9. All-days PCA coloured by attack type (left) and real-vs-generated (right).</w:t>
-      </w:r>
-    </w:p>
-    <w:p>
-      <w:pPr>
-        <w:spacing w:after="140"/>
-        <w:jc w:val="both"/>
-      </w:pPr>
-      <w:r>
-        <w:rPr/>
-        <w:t xml:space="preserve">Combining all eight days with per-file capping gives 125,310 rows across every attack family (Figure 9). The generator covers the dense centre well, including BENIGN, DoS Hulk and true DDoS, but under-represents the smaller clusters, and this diversity made alignment worse: the mean error on means rose from 0.0723 to 0.1141 and on standard deviations from 0.3179 to 0.3544. Asking one unconditional generator to cover many modes cost more than the extra data returned, so a class-conditional GAN or one model per family is the clear next step.</w:t>
+        <w:t xml:space="preserve">Figure 7. All-days PCA coloured by attack type (left) and real-vs-generated (right).</w:t>
+      </w:r>
+    </w:p>
+    <w:p>
+      <w:pPr>
+        <w:spacing w:after="140"/>
+        <w:jc w:val="both"/>
+      </w:pPr>
+      <w:r>
+        <w:rPr/>
+        <w:t xml:space="preserve">Combining all eight days with per-file capping gives 125,310 rows across every attack family (Figure 7). The generator covers the dense centre well, including BENIGN, DoS Hulk and true DDoS, but under-represents the smaller clusters, and this diversity made alignment worse: the mean error on means rose from 0.0723 to 0.1141 and on standard deviations from 0.3179 to 0.3544. Asking one unconditional generator to cover many modes cost more than the extra data returned, so a class-conditional GAN or one model per family is the clear next step.</w:t>
       </w:r>
     </w:p>
     <w:p>
@@ -907,17 +777,17 @@
           <w:i/>
           <w:sz w:val="18"/>
         </w:rPr>
-        <w:t xml:space="preserve">Figure 10. QuickDraw DCGAN training loss curves.</w:t>
-      </w:r>
-    </w:p>
-    <w:p>
-      <w:pPr>
-        <w:spacing w:after="140"/>
-        <w:jc w:val="both"/>
-      </w:pPr>
-      <w:r>
-        <w:rPr/>
-        <w:t xml:space="preserve">Figure 10 shows the discriminator loss staying low, around 0.34 to 0.9, while the generator loss swings through 1.3 to 6.1 as the two trade advantage; with no runaway spike and no flat-lined trace, training is stable across all 50 epochs.</w:t>
+        <w:t xml:space="preserve">Figure 8. QuickDraw DCGAN training loss curves.</w:t>
+      </w:r>
+    </w:p>
+    <w:p>
+      <w:pPr>
+        <w:spacing w:after="140"/>
+        <w:jc w:val="both"/>
+      </w:pPr>
+      <w:r>
+        <w:rPr/>
+        <w:t xml:space="preserve">Figure 8 shows the discriminator loss staying low, around 0.34 to 0.9, while the generator loss swings through 1.3 to 6.1 as the two trade advantage; with no runaway spike and no flat-lined trace, training is stable across all 50 epochs.</w:t>
       </w:r>
     </w:p>
     <w:p>
@@ -977,17 +847,17 @@
           <w:i/>
           <w:sz w:val="18"/>
         </w:rPr>
-        <w:t xml:space="preserve">Figure 11. Real (left) vs generated (right) birthday-cake sketches.</w:t>
-      </w:r>
-    </w:p>
-    <w:p>
-      <w:pPr>
-        <w:spacing w:after="140"/>
-        <w:jc w:val="both"/>
-      </w:pPr>
-      <w:r>
-        <w:rPr/>
-        <w:t xml:space="preserve">In Figure 11 the final cakes are easy to read and vary across the grid, so there is no mode collapse; the flaws are the usual line-art ones, broken or doubled strokes and a little speckle. The FID is 32.59, well below the OCT scans' 66.83, which fits the intuition that clean line art sits more comfortably in InceptionV3's feature space than soft medical texture.</w:t>
+        <w:t xml:space="preserve">Figure 9. Real (left) vs generated (right) birthday-cake sketches.</w:t>
+      </w:r>
+    </w:p>
+    <w:p>
+      <w:pPr>
+        <w:spacing w:after="140"/>
+        <w:jc w:val="both"/>
+      </w:pPr>
+      <w:r>
+        <w:rPr/>
+        <w:t xml:space="preserve">In Figure 9 the final cakes are easy to read and vary across the grid, so there is no mode collapse; the flaws are the usual line-art ones, broken or doubled strokes and a little speckle. The FID is 32.59, well below the OCT scans' 66.83, which fits the intuition that clean line art sits more comfortably in InceptionV3's feature space than soft medical texture.</w:t>
       </w:r>
     </w:p>
     <w:p>
@@ -1047,17 +917,17 @@
           <w:i/>
           <w:sz w:val="18"/>
         </w:rPr>
-        <w:t xml:space="preserve">Figure 12. Generated cake samples across epochs (1, 13, 26, 38, 50).</w:t>
-      </w:r>
-    </w:p>
-    <w:p>
-      <w:pPr>
-        <w:spacing w:after="140"/>
-        <w:jc w:val="both"/>
-      </w:pPr>
-      <w:r>
-        <w:rPr/>
-        <w:t xml:space="preserve">In Figure 12 the progression across epochs (1, 13, 26, 38, 50) shows the outline and candles appearing early and then sharpening, evidence the generator is learning cake structure and not memorising a fixed example.</w:t>
+        <w:t xml:space="preserve">Figure 10. Generated cake samples across epochs (1, 13, 26, 38, 50).</w:t>
+      </w:r>
+    </w:p>
+    <w:p>
+      <w:pPr>
+        <w:spacing w:after="140"/>
+        <w:jc w:val="both"/>
+      </w:pPr>
+      <w:r>
+        <w:rPr/>
+        <w:t xml:space="preserve">In Figure 10 the progression across epochs (1, 13, 26, 38, 50) shows the outline and candles appearing early and then sharpening, evidence the generator is learning cake structure and not memorising a fixed example.</w:t>
       </w:r>
     </w:p>
     <w:p>
@@ -1117,17 +987,17 @@
           <w:i/>
           <w:sz w:val="18"/>
         </w:rPr>
-        <w:t xml:space="preserve">Figure 13. FID by category (left) vs mean ink density (right).</w:t>
-      </w:r>
-    </w:p>
-    <w:p>
-      <w:pPr>
-        <w:spacing w:after="140"/>
-        <w:jc w:val="both"/>
-      </w:pPr>
-      <w:r>
-        <w:rPr/>
-        <w:t xml:space="preserve">Training the same DCGAN on cat and house weighs FID against a cheap complexity proxy, mean ink density (Figure 13). The orderings differ: by FID it is house (24.75), cake (32.59), cat (41.09), while by ink density it is house (0.2368), cat (0.2655), cake (0.2708). House is easiest on both, yet cake beats cat despite the highest ink density, so ink coverage alone does not predict difficulty; a house is close to a fixed template, cats vary most in pose and outline, and cakes sit between, so structural variety drives difficulty more than ink coverage.</w:t>
+        <w:t xml:space="preserve">Figure 11. FID by category (left) vs mean ink density (right).</w:t>
+      </w:r>
+    </w:p>
+    <w:p>
+      <w:pPr>
+        <w:spacing w:after="140"/>
+        <w:jc w:val="both"/>
+      </w:pPr>
+      <w:r>
+        <w:rPr/>
+        <w:t xml:space="preserve">Training the same DCGAN on cat and house weighs FID against a cheap complexity proxy, mean ink density (Figure 11). The orderings differ: by FID it is house (24.75), cake (32.59), cat (41.09), while by ink density it is house (0.2368), cat (0.2655), cake (0.2708). House is easiest on both, yet cake beats cat despite the highest ink density, so ink coverage alone does not predict difficulty; a house is close to a fixed template, cats vary most in pose and outline, and cakes sit between, so structural variety drives difficulty more than ink coverage.</w:t>
       </w:r>
     </w:p>
     <w:p>
@@ -1847,7 +1717,7 @@
       </w:pPr>
       <w:r>
         <w:rPr/>
-        <w:t xml:space="preserve">Read across the table, the image GANs line up with visual quality: the clean QuickDraw sketches beat the soft OCT scans on FID, and the repetitive house is easiest by a wide margin. The tabular GAN, judged on distribution alignment, reverses the usual 'more data helps' intuition, since widening from one day to all eight nearly doubles the mean gap and inflates the variance gap. The conditional OCT model shows class control is achievable at a comparable stability cost.</w:t>
+        <w:t xml:space="preserve">Read across the table, the image GANs track visual quality, with the clean QuickDraw sketches beating the soft OCT scans on FID and the repetitive house easiest by a clear margin, while the tabular GAN reverses the usual 'more data helps' intuition as its gaps widen from one day to all eight. The conditional OCT model shows class control is achievable at a comparable stability cost.</w:t>
       </w:r>
     </w:p>
     <w:p>

</xml_diff>